<commit_message>
Smart Reporter en español, datos variables (DDT), correcciones del pipeline y diagramas
playwright-smart-reporter con interfaz en español y guía para stakeholders; corrige evidencias y JUnit del pipeline; BDD de API; accesibilidad en español; diagramas draw.io
</commit_message>
<xml_diff>
--- a/Documentation/Manual_Tecnico_Ingenieros_Automatizacion.docx
+++ b/Documentation/Manual_Tecnico_Ingenieros_Automatizacion.docx
@@ -2695,6 +2695,748 @@
     </w:p>
     <w:p>
       <w:pPr>
+        <w:pStyle w:val="Heading2"/>
+        <w:spacing w:after="160" w:before="360"/>
+      </w:pPr>
+      <w:r>
+        <w:rPr>
+          <w:b/>
+          <w:bCs/>
+          <w:color w:val="2E5C8A"/>
+          <w:sz w:val="26"/>
+          <w:szCs w:val="26"/>
+        </w:rPr>
+        <w:t xml:space="preserve">3.2 Paralelización de la generación — utils/concurrency.ts</w:t>
+      </w:r>
+    </w:p>
+    <w:p>
+      <w:pPr>
+        <w:spacing w:after="180" w:line="300"/>
+        <w:jc w:val="both"/>
+      </w:pPr>
+      <w:r>
+        <w:rPr>
+          <w:rFonts w:ascii="Calibri" w:cs="Calibri" w:eastAsia="Calibri" w:hAnsi="Calibri"/>
+          <w:sz w:val="22"/>
+          <w:szCs w:val="22"/>
+        </w:rPr>
+        <w:t xml:space="preserve">Hasta esta sesión, tanto el loop de suites de run-agents.ts como el loop de archivos de BoxAPIsExecute/ en box-api-executor.agent.ts procesaban cada elemento en un for...of estrictamente secuencial, aunque son independientes entre sí (cada suite/archivo lee y escribe solo sus propios archivos namespaced). Dado que varios pasos hacen llamadas a OpenAI (cientos de ms a varios segundos de latencia de red por llamada), procesar N suites en serie multiplica el tiempo total por N.</w:t>
+      </w:r>
+    </w:p>
+    <w:p>
+      <w:pPr>
+        <w:spacing w:after="180" w:line="300"/>
+        <w:jc w:val="both"/>
+      </w:pPr>
+      <w:r>
+        <w:rPr>
+          <w:rFonts w:ascii="Consolas" w:cs="Consolas" w:eastAsia="Consolas" w:hAnsi="Consolas"/>
+          <w:color w:val="C0392B"/>
+          <w:sz w:val="20"/>
+          <w:szCs w:val="20"/>
+        </w:rPr>
+        <w:t xml:space="preserve">ConfigurationAgents/ia-testing/utils/concurrency.ts</w:t>
+      </w:r>
+      <w:r>
+        <w:rPr>
+          <w:rFonts w:ascii="Calibri" w:cs="Calibri" w:eastAsia="Calibri" w:hAnsi="Calibri"/>
+          <w:sz w:val="22"/>
+          <w:szCs w:val="22"/>
+        </w:rPr>
+        <w:t xml:space="preserve"> (nuevo) exporta un pool de workers con límite de concurrencia acotado — deliberadamente NO un </w:t>
+      </w:r>
+      <w:r>
+        <w:rPr>
+          <w:rFonts w:ascii="Consolas" w:cs="Consolas" w:eastAsia="Consolas" w:hAnsi="Consolas"/>
+          <w:color w:val="C0392B"/>
+          <w:sz w:val="20"/>
+          <w:szCs w:val="20"/>
+        </w:rPr>
+        <w:t xml:space="preserve">Promise.all</w:t>
+      </w:r>
+      <w:r>
+        <w:rPr>
+          <w:rFonts w:ascii="Calibri" w:cs="Calibri" w:eastAsia="Calibri" w:hAnsi="Calibri"/>
+          <w:sz w:val="22"/>
+          <w:szCs w:val="22"/>
+        </w:rPr>
+        <w:t xml:space="preserve"> sin límite, para no arriesgar rate-limits de la API de OpenAI cuando hay muchas suites:</w:t>
+      </w:r>
+    </w:p>
+    <w:tbl>
+      <w:tblPr>
+        <w:tblW w:type="pct" w:w="100%"/>
+        <w:tblBorders>
+          <w:top w:val="single" w:color="auto" w:sz="4"/>
+          <w:left w:val="single" w:color="auto" w:sz="4"/>
+          <w:bottom w:val="single" w:color="auto" w:sz="4"/>
+          <w:right w:val="single" w:color="auto" w:sz="4"/>
+          <w:insideH w:val="single" w:color="auto" w:sz="4"/>
+          <w:insideV w:val="single" w:color="auto" w:sz="4"/>
+        </w:tblBorders>
+        <w:tblCellMar>
+          <w:top w:type="dxa" w:w="100"/>
+          <w:bottom w:type="dxa" w:w="200"/>
+        </w:tblCellMar>
+      </w:tblPr>
+      <w:tblGrid>
+        <w:gridCol w:w="9350"/>
+      </w:tblGrid>
+      <w:tr>
+        <w:tc>
+          <w:tcPr>
+            <w:tcW w:type="dxa" w:w="9350"/>
+            <w:shd w:fill="2B2B2B" w:val="clear"/>
+            <w:tcMar>
+              <w:top w:type="dxa" w:w="160"/>
+              <w:left w:type="dxa" w:w="200"/>
+              <w:bottom w:type="dxa" w:w="160"/>
+              <w:right w:type="dxa" w:w="200"/>
+            </w:tcMar>
+          </w:tcPr>
+          <w:p>
+            <w:pPr>
+              <w:spacing w:after="0" w:line="260"/>
+            </w:pPr>
+            <w:r>
+              <w:rPr>
+                <w:rFonts w:ascii="Consolas" w:cs="Consolas" w:eastAsia="Consolas" w:hAnsi="Consolas"/>
+                <w:color w:val="F5F5F5"/>
+                <w:sz w:val="20"/>
+                <w:szCs w:val="20"/>
+              </w:rPr>
+              <w:t xml:space="preserve">export async function mapWithConcurrency&lt;T, R&gt;(</w:t>
+            </w:r>
+          </w:p>
+          <w:p>
+            <w:pPr>
+              <w:spacing w:after="0" w:line="260"/>
+            </w:pPr>
+            <w:r>
+              <w:rPr>
+                <w:rFonts w:ascii="Consolas" w:cs="Consolas" w:eastAsia="Consolas" w:hAnsi="Consolas"/>
+                <w:color w:val="F5F5F5"/>
+                <w:sz w:val="20"/>
+                <w:szCs w:val="20"/>
+              </w:rPr>
+              <w:t xml:space="preserve">  items: T[], limit: number, fn: (item: T, index: number) =&gt; Promise&lt;R&gt;,</w:t>
+            </w:r>
+          </w:p>
+          <w:p>
+            <w:pPr>
+              <w:spacing w:after="0" w:line="260"/>
+            </w:pPr>
+            <w:r>
+              <w:rPr>
+                <w:rFonts w:ascii="Consolas" w:cs="Consolas" w:eastAsia="Consolas" w:hAnsi="Consolas"/>
+                <w:color w:val="F5F5F5"/>
+                <w:sz w:val="20"/>
+                <w:szCs w:val="20"/>
+              </w:rPr>
+              <w:t xml:space="preserve">): Promise&lt;R[]&gt; {</w:t>
+            </w:r>
+          </w:p>
+          <w:p>
+            <w:pPr>
+              <w:spacing w:after="0" w:line="260"/>
+            </w:pPr>
+            <w:r>
+              <w:rPr>
+                <w:rFonts w:ascii="Consolas" w:cs="Consolas" w:eastAsia="Consolas" w:hAnsi="Consolas"/>
+                <w:color w:val="F5F5F5"/>
+                <w:sz w:val="20"/>
+                <w:szCs w:val="20"/>
+              </w:rPr>
+              <w:t xml:space="preserve">  const results: R[] = new Array(items.length);</w:t>
+            </w:r>
+          </w:p>
+          <w:p>
+            <w:pPr>
+              <w:spacing w:after="0" w:line="260"/>
+            </w:pPr>
+            <w:r>
+              <w:rPr>
+                <w:rFonts w:ascii="Consolas" w:cs="Consolas" w:eastAsia="Consolas" w:hAnsi="Consolas"/>
+                <w:color w:val="F5F5F5"/>
+                <w:sz w:val="20"/>
+                <w:szCs w:val="20"/>
+              </w:rPr>
+              <w:t xml:space="preserve">  let nextIndex = 0;</w:t>
+            </w:r>
+          </w:p>
+          <w:p>
+            <w:pPr>
+              <w:spacing w:after="0" w:line="260"/>
+            </w:pPr>
+            <w:r>
+              <w:rPr>
+                <w:rFonts w:ascii="Consolas" w:cs="Consolas" w:eastAsia="Consolas" w:hAnsi="Consolas"/>
+                <w:color w:val="F5F5F5"/>
+                <w:sz w:val="20"/>
+                <w:szCs w:val="20"/>
+              </w:rPr>
+              <w:t xml:space="preserve">  async function worker(): Promise&lt;void&gt; {</w:t>
+            </w:r>
+          </w:p>
+          <w:p>
+            <w:pPr>
+              <w:spacing w:after="0" w:line="260"/>
+            </w:pPr>
+            <w:r>
+              <w:rPr>
+                <w:rFonts w:ascii="Consolas" w:cs="Consolas" w:eastAsia="Consolas" w:hAnsi="Consolas"/>
+                <w:color w:val="F5F5F5"/>
+                <w:sz w:val="20"/>
+                <w:szCs w:val="20"/>
+              </w:rPr>
+              <w:t xml:space="preserve">    while (nextIndex &lt; items.length) {</w:t>
+            </w:r>
+          </w:p>
+          <w:p>
+            <w:pPr>
+              <w:spacing w:after="0" w:line="260"/>
+            </w:pPr>
+            <w:r>
+              <w:rPr>
+                <w:rFonts w:ascii="Consolas" w:cs="Consolas" w:eastAsia="Consolas" w:hAnsi="Consolas"/>
+                <w:color w:val="F5F5F5"/>
+                <w:sz w:val="20"/>
+                <w:szCs w:val="20"/>
+              </w:rPr>
+              <w:t xml:space="preserve">      const current = nextIndex++;</w:t>
+            </w:r>
+          </w:p>
+          <w:p>
+            <w:pPr>
+              <w:spacing w:after="0" w:line="260"/>
+            </w:pPr>
+            <w:r>
+              <w:rPr>
+                <w:rFonts w:ascii="Consolas" w:cs="Consolas" w:eastAsia="Consolas" w:hAnsi="Consolas"/>
+                <w:color w:val="F5F5F5"/>
+                <w:sz w:val="20"/>
+                <w:szCs w:val="20"/>
+              </w:rPr>
+              <w:t xml:space="preserve">      results[current] = await fn(items[current], current);</w:t>
+            </w:r>
+          </w:p>
+          <w:p>
+            <w:pPr>
+              <w:spacing w:after="0" w:line="260"/>
+            </w:pPr>
+            <w:r>
+              <w:rPr>
+                <w:rFonts w:ascii="Consolas" w:cs="Consolas" w:eastAsia="Consolas" w:hAnsi="Consolas"/>
+                <w:color w:val="F5F5F5"/>
+                <w:sz w:val="20"/>
+                <w:szCs w:val="20"/>
+              </w:rPr>
+              <w:t xml:space="preserve">    }</w:t>
+            </w:r>
+          </w:p>
+          <w:p>
+            <w:pPr>
+              <w:spacing w:after="0" w:line="260"/>
+            </w:pPr>
+            <w:r>
+              <w:rPr>
+                <w:rFonts w:ascii="Consolas" w:cs="Consolas" w:eastAsia="Consolas" w:hAnsi="Consolas"/>
+                <w:color w:val="F5F5F5"/>
+                <w:sz w:val="20"/>
+                <w:szCs w:val="20"/>
+              </w:rPr>
+              <w:t xml:space="preserve">  }</w:t>
+            </w:r>
+          </w:p>
+          <w:p>
+            <w:pPr>
+              <w:spacing w:after="0" w:line="260"/>
+            </w:pPr>
+            <w:r>
+              <w:rPr>
+                <w:rFonts w:ascii="Consolas" w:cs="Consolas" w:eastAsia="Consolas" w:hAnsi="Consolas"/>
+                <w:color w:val="F5F5F5"/>
+                <w:sz w:val="20"/>
+                <w:szCs w:val="20"/>
+              </w:rPr>
+              <w:t xml:space="preserve">  const poolSize = Math.max(1, Math.min(limit, items.length));</w:t>
+            </w:r>
+          </w:p>
+          <w:p>
+            <w:pPr>
+              <w:spacing w:after="0" w:line="260"/>
+            </w:pPr>
+            <w:r>
+              <w:rPr>
+                <w:rFonts w:ascii="Consolas" w:cs="Consolas" w:eastAsia="Consolas" w:hAnsi="Consolas"/>
+                <w:color w:val="F5F5F5"/>
+                <w:sz w:val="20"/>
+                <w:szCs w:val="20"/>
+              </w:rPr>
+              <w:t xml:space="preserve">  await Promise.all(Array.from({ length: poolSize }, () =&gt; worker()));</w:t>
+            </w:r>
+          </w:p>
+          <w:p>
+            <w:pPr>
+              <w:spacing w:after="0" w:line="260"/>
+            </w:pPr>
+            <w:r>
+              <w:rPr>
+                <w:rFonts w:ascii="Consolas" w:cs="Consolas" w:eastAsia="Consolas" w:hAnsi="Consolas"/>
+                <w:color w:val="F5F5F5"/>
+                <w:sz w:val="20"/>
+                <w:szCs w:val="20"/>
+              </w:rPr>
+              <w:t xml:space="preserve">  return results;</w:t>
+            </w:r>
+          </w:p>
+          <w:p>
+            <w:pPr>
+              <w:spacing w:after="0" w:line="260"/>
+            </w:pPr>
+            <w:r>
+              <w:rPr>
+                <w:rFonts w:ascii="Consolas" w:cs="Consolas" w:eastAsia="Consolas" w:hAnsi="Consolas"/>
+                <w:color w:val="F5F5F5"/>
+                <w:sz w:val="20"/>
+                <w:szCs w:val="20"/>
+              </w:rPr>
+              <w:t xml:space="preserve">}</w:t>
+            </w:r>
+          </w:p>
+        </w:tc>
+      </w:tr>
+    </w:tbl>
+    <w:p>
+      <w:pPr>
+        <w:spacing w:after="180" w:line="300"/>
+        <w:jc w:val="both"/>
+      </w:pPr>
+      <w:r>
+        <w:rPr>
+          <w:rFonts w:ascii="Calibri" w:cs="Calibri" w:eastAsia="Calibri" w:hAnsi="Calibri"/>
+          <w:sz w:val="22"/>
+          <w:szCs w:val="22"/>
+        </w:rPr>
+        <w:t xml:space="preserve">Los resultados se devuelven en el mismo orden que items (indexados por posición original) aunque la ejecución interna sea concurrente — importante porque box-api-executor.agent.ts acumula collectedSpecs para construir después la tabla SOAP_BODIES.</w:t>
+      </w:r>
+    </w:p>
+    <w:tbl>
+      <w:tblPr>
+        <w:tblW w:type="dxa" w:w="9250"/>
+        <w:tblBorders>
+          <w:top w:val="single" w:color="auto" w:sz="4"/>
+          <w:left w:val="single" w:color="auto" w:sz="4"/>
+          <w:bottom w:val="single" w:color="auto" w:sz="4"/>
+          <w:right w:val="single" w:color="auto" w:sz="4"/>
+          <w:insideH w:val="single" w:color="auto" w:sz="4"/>
+          <w:insideV w:val="single" w:color="auto" w:sz="4"/>
+        </w:tblBorders>
+      </w:tblPr>
+      <w:tblGrid>
+        <w:gridCol w:w="2400"/>
+        <w:gridCol w:w="3400"/>
+        <w:gridCol w:w="3450"/>
+      </w:tblGrid>
+      <w:tr>
+        <w:trPr>
+          <w:tblHeader/>
+        </w:trPr>
+        <w:tc>
+          <w:tcPr>
+            <w:tcW w:type="dxa" w:w="2400"/>
+            <w:shd w:fill="1F3864" w:val="clear"/>
+            <w:tcMar>
+              <w:top w:type="dxa" w:w="100"/>
+              <w:left w:type="dxa" w:w="120"/>
+              <w:bottom w:type="dxa" w:w="100"/>
+              <w:right w:type="dxa" w:w="120"/>
+            </w:tcMar>
+            <w:vAlign w:val="center"/>
+          </w:tcPr>
+          <w:p>
+            <w:r>
+              <w:rPr>
+                <w:rFonts w:ascii="Calibri" w:cs="Calibri" w:eastAsia="Calibri" w:hAnsi="Calibri"/>
+                <w:b/>
+                <w:bCs/>
+                <w:color w:val="FFFFFF"/>
+                <w:sz w:val="20"/>
+                <w:szCs w:val="20"/>
+              </w:rPr>
+              <w:t xml:space="preserve">Consumidor</w:t>
+            </w:r>
+          </w:p>
+        </w:tc>
+        <w:tc>
+          <w:tcPr>
+            <w:tcW w:type="dxa" w:w="3400"/>
+            <w:shd w:fill="1F3864" w:val="clear"/>
+            <w:tcMar>
+              <w:top w:type="dxa" w:w="100"/>
+              <w:left w:type="dxa" w:w="120"/>
+              <w:bottom w:type="dxa" w:w="100"/>
+              <w:right w:type="dxa" w:w="120"/>
+            </w:tcMar>
+            <w:vAlign w:val="center"/>
+          </w:tcPr>
+          <w:p>
+            <w:r>
+              <w:rPr>
+                <w:rFonts w:ascii="Calibri" w:cs="Calibri" w:eastAsia="Calibri" w:hAnsi="Calibri"/>
+                <w:b/>
+                <w:bCs/>
+                <w:color w:val="FFFFFF"/>
+                <w:sz w:val="20"/>
+                <w:szCs w:val="20"/>
+              </w:rPr>
+              <w:t xml:space="preserve">Qué paraleliza</w:t>
+            </w:r>
+          </w:p>
+        </w:tc>
+        <w:tc>
+          <w:tcPr>
+            <w:tcW w:type="dxa" w:w="3450"/>
+            <w:shd w:fill="1F3864" w:val="clear"/>
+            <w:tcMar>
+              <w:top w:type="dxa" w:w="100"/>
+              <w:left w:type="dxa" w:w="120"/>
+              <w:bottom w:type="dxa" w:w="100"/>
+              <w:right w:type="dxa" w:w="120"/>
+            </w:tcMar>
+            <w:vAlign w:val="center"/>
+          </w:tcPr>
+          <w:p>
+            <w:r>
+              <w:rPr>
+                <w:rFonts w:ascii="Calibri" w:cs="Calibri" w:eastAsia="Calibri" w:hAnsi="Calibri"/>
+                <w:b/>
+                <w:bCs/>
+                <w:color w:val="FFFFFF"/>
+                <w:sz w:val="20"/>
+                <w:szCs w:val="20"/>
+              </w:rPr>
+              <w:t xml:space="preserve">Conversión requerida</w:t>
+            </w:r>
+          </w:p>
+        </w:tc>
+      </w:tr>
+      <w:tr>
+        <w:tc>
+          <w:tcPr>
+            <w:tcW w:type="dxa" w:w="2400"/>
+            <w:shd w:fill="FFFFFF" w:val="clear"/>
+            <w:tcMar>
+              <w:top w:type="dxa" w:w="90"/>
+              <w:left w:type="dxa" w:w="120"/>
+              <w:bottom w:type="dxa" w:w="90"/>
+              <w:right w:type="dxa" w:w="120"/>
+            </w:tcMar>
+            <w:vAlign w:val="center"/>
+          </w:tcPr>
+          <w:p>
+            <w:pPr>
+              <w:spacing w:line="260"/>
+            </w:pPr>
+            <w:r>
+              <w:rPr>
+                <w:rFonts w:ascii="Calibri" w:cs="Calibri" w:eastAsia="Calibri" w:hAnsi="Calibri"/>
+                <w:sz w:val="22"/>
+                <w:szCs w:val="22"/>
+              </w:rPr>
+              <w:t xml:space="preserve">run-agents.ts</w:t>
+            </w:r>
+          </w:p>
+        </w:tc>
+        <w:tc>
+          <w:tcPr>
+            <w:tcW w:type="dxa" w:w="3400"/>
+            <w:shd w:fill="FFFFFF" w:val="clear"/>
+            <w:tcMar>
+              <w:top w:type="dxa" w:w="90"/>
+              <w:left w:type="dxa" w:w="120"/>
+              <w:bottom w:type="dxa" w:w="90"/>
+              <w:right w:type="dxa" w:w="120"/>
+            </w:tcMar>
+            <w:vAlign w:val="center"/>
+          </w:tcPr>
+          <w:p>
+            <w:pPr>
+              <w:spacing w:line="260"/>
+            </w:pPr>
+            <w:r>
+              <w:rPr>
+                <w:rFonts w:ascii="Calibri" w:cs="Calibri" w:eastAsia="Calibri" w:hAnsi="Calibri"/>
+                <w:sz w:val="22"/>
+                <w:szCs w:val="22"/>
+              </w:rPr>
+              <w:t xml:space="preserve">El loop principal (un elemento por recording en BoxRecordings/recordings/)</w:t>
+            </w:r>
+          </w:p>
+        </w:tc>
+        <w:tc>
+          <w:tcPr>
+            <w:tcW w:type="dxa" w:w="3450"/>
+            <w:shd w:fill="FFFFFF" w:val="clear"/>
+            <w:tcMar>
+              <w:top w:type="dxa" w:w="90"/>
+              <w:left w:type="dxa" w:w="120"/>
+              <w:bottom w:type="dxa" w:w="90"/>
+              <w:right w:type="dxa" w:w="120"/>
+            </w:tcMar>
+            <w:vAlign w:val="center"/>
+          </w:tcPr>
+          <w:p>
+            <w:pPr>
+              <w:spacing w:line="260"/>
+            </w:pPr>
+            <w:r>
+              <w:rPr>
+                <w:rFonts w:ascii="Calibri" w:cs="Calibri" w:eastAsia="Calibri" w:hAnsi="Calibri"/>
+                <w:sz w:val="22"/>
+                <w:szCs w:val="22"/>
+              </w:rPr>
+              <w:t xml:space="preserve">El </w:t>
+            </w:r>
+            <w:r>
+              <w:rPr>
+                <w:rFonts w:ascii="Consolas" w:cs="Consolas" w:eastAsia="Consolas" w:hAnsi="Consolas"/>
+                <w:color w:val="C0392B"/>
+                <w:sz w:val="20"/>
+                <w:szCs w:val="20"/>
+              </w:rPr>
+              <w:t xml:space="preserve">for (const file of files) { ... continue; ... }</w:t>
+            </w:r>
+            <w:r>
+              <w:rPr>
+                <w:rFonts w:ascii="Calibri" w:cs="Calibri" w:eastAsia="Calibri" w:hAnsi="Calibri"/>
+                <w:sz w:val="22"/>
+                <w:szCs w:val="22"/>
+              </w:rPr>
+              <w:t xml:space="preserve"> pasó a </w:t>
+            </w:r>
+            <w:r>
+              <w:rPr>
+                <w:rFonts w:ascii="Consolas" w:cs="Consolas" w:eastAsia="Consolas" w:hAnsi="Consolas"/>
+                <w:color w:val="C0392B"/>
+                <w:sz w:val="20"/>
+                <w:szCs w:val="20"/>
+              </w:rPr>
+              <w:t xml:space="preserve">await mapWithConcurrency(files, N, async (file) =&gt; { ... return; ... })</w:t>
+            </w:r>
+            <w:r>
+              <w:rPr>
+                <w:rFonts w:ascii="Calibri" w:cs="Calibri" w:eastAsia="Calibri" w:hAnsi="Calibri"/>
+                <w:sz w:val="22"/>
+                <w:szCs w:val="22"/>
+              </w:rPr>
+              <w:t xml:space="preserve"> — cada </w:t>
+            </w:r>
+            <w:r>
+              <w:rPr>
+                <w:rFonts w:ascii="Consolas" w:cs="Consolas" w:eastAsia="Consolas" w:hAnsi="Consolas"/>
+                <w:color w:val="C0392B"/>
+                <w:sz w:val="20"/>
+                <w:szCs w:val="20"/>
+              </w:rPr>
+              <w:t xml:space="preserve">continue</w:t>
+            </w:r>
+            <w:r>
+              <w:rPr>
+                <w:rFonts w:ascii="Calibri" w:cs="Calibri" w:eastAsia="Calibri" w:hAnsi="Calibri"/>
+                <w:sz w:val="22"/>
+                <w:szCs w:val="22"/>
+              </w:rPr>
+              <w:t xml:space="preserve"> se convirtió en </w:t>
+            </w:r>
+            <w:r>
+              <w:rPr>
+                <w:rFonts w:ascii="Consolas" w:cs="Consolas" w:eastAsia="Consolas" w:hAnsi="Consolas"/>
+                <w:color w:val="C0392B"/>
+                <w:sz w:val="20"/>
+                <w:szCs w:val="20"/>
+              </w:rPr>
+              <w:t xml:space="preserve">return</w:t>
+            </w:r>
+            <w:r>
+              <w:rPr>
+                <w:rFonts w:ascii="Calibri" w:cs="Calibri" w:eastAsia="Calibri" w:hAnsi="Calibri"/>
+                <w:sz w:val="22"/>
+                <w:szCs w:val="22"/>
+              </w:rPr>
+              <w:t xml:space="preserve"> (salida temprana de la función, mismo efecto dentro de un callback async).</w:t>
+            </w:r>
+          </w:p>
+        </w:tc>
+      </w:tr>
+      <w:tr>
+        <w:tc>
+          <w:tcPr>
+            <w:tcW w:type="dxa" w:w="2400"/>
+            <w:shd w:fill="F4F6F7" w:val="clear"/>
+            <w:tcMar>
+              <w:top w:type="dxa" w:w="90"/>
+              <w:left w:type="dxa" w:w="120"/>
+              <w:bottom w:type="dxa" w:w="90"/>
+              <w:right w:type="dxa" w:w="120"/>
+            </w:tcMar>
+            <w:vAlign w:val="center"/>
+          </w:tcPr>
+          <w:p>
+            <w:pPr>
+              <w:spacing w:line="260"/>
+            </w:pPr>
+            <w:r>
+              <w:rPr>
+                <w:rFonts w:ascii="Calibri" w:cs="Calibri" w:eastAsia="Calibri" w:hAnsi="Calibri"/>
+                <w:sz w:val="22"/>
+                <w:szCs w:val="22"/>
+              </w:rPr>
+              <w:t xml:space="preserve">box-api-executor.agent.ts</w:t>
+            </w:r>
+          </w:p>
+        </w:tc>
+        <w:tc>
+          <w:tcPr>
+            <w:tcW w:type="dxa" w:w="3400"/>
+            <w:shd w:fill="F4F6F7" w:val="clear"/>
+            <w:tcMar>
+              <w:top w:type="dxa" w:w="90"/>
+              <w:left w:type="dxa" w:w="120"/>
+              <w:bottom w:type="dxa" w:w="90"/>
+              <w:right w:type="dxa" w:w="120"/>
+            </w:tcMar>
+            <w:vAlign w:val="center"/>
+          </w:tcPr>
+          <w:p>
+            <w:pPr>
+              <w:spacing w:line="260"/>
+            </w:pPr>
+            <w:r>
+              <w:rPr>
+                <w:rFonts w:ascii="Calibri" w:cs="Calibri" w:eastAsia="Calibri" w:hAnsi="Calibri"/>
+                <w:sz w:val="22"/>
+                <w:szCs w:val="22"/>
+              </w:rPr>
+              <w:t xml:space="preserve">El loop sobre specFiles (cada .spec.ts encontrado en BoxAPIsExecute/)</w:t>
+            </w:r>
+          </w:p>
+        </w:tc>
+        <w:tc>
+          <w:tcPr>
+            <w:tcW w:type="dxa" w:w="3450"/>
+            <w:shd w:fill="F4F6F7" w:val="clear"/>
+            <w:tcMar>
+              <w:top w:type="dxa" w:w="90"/>
+              <w:left w:type="dxa" w:w="120"/>
+              <w:bottom w:type="dxa" w:w="90"/>
+              <w:right w:type="dxa" w:w="120"/>
+            </w:tcMar>
+            <w:vAlign w:val="center"/>
+          </w:tcPr>
+          <w:p>
+            <w:pPr>
+              <w:spacing w:line="260"/>
+            </w:pPr>
+            <w:r>
+              <w:rPr>
+                <w:rFonts w:ascii="Calibri" w:cs="Calibri" w:eastAsia="Calibri" w:hAnsi="Calibri"/>
+                <w:sz w:val="22"/>
+                <w:szCs w:val="22"/>
+              </w:rPr>
+              <w:t xml:space="preserve">Mismo patrón for...of → mapWithConcurrency, mismo cambio continue → return.</w:t>
+            </w:r>
+          </w:p>
+        </w:tc>
+      </w:tr>
+    </w:tbl>
+    <w:tbl>
+      <w:tblPr>
+        <w:tblW w:type="pct" w:w="100%"/>
+        <w:tblBorders>
+          <w:top w:val="single" w:color="auto" w:sz="4"/>
+          <w:left w:val="single" w:color="auto" w:sz="4"/>
+          <w:bottom w:val="single" w:color="auto" w:sz="4"/>
+          <w:right w:val="single" w:color="auto" w:sz="4"/>
+          <w:insideH w:val="single" w:color="auto" w:sz="4"/>
+          <w:insideV w:val="single" w:color="auto" w:sz="4"/>
+        </w:tblBorders>
+        <w:tblCellMar>
+          <w:top w:type="dxa" w:w="160"/>
+          <w:bottom w:type="dxa" w:w="220"/>
+        </w:tblCellMar>
+      </w:tblPr>
+      <w:tblGrid>
+        <w:gridCol w:w="140"/>
+        <w:gridCol w:w="9210"/>
+      </w:tblGrid>
+      <w:tr>
+        <w:tc>
+          <w:tcPr>
+            <w:tcW w:type="dxa" w:w="140"/>
+            <w:shd w:fill="2E5C8A" w:val="clear"/>
+          </w:tcPr>
+          <w:p/>
+        </w:tc>
+        <w:tc>
+          <w:tcPr>
+            <w:tcW w:type="dxa" w:w="9210"/>
+            <w:shd w:fill="E7F1FA" w:val="clear"/>
+            <w:tcMar>
+              <w:top w:type="dxa" w:w="160"/>
+              <w:left w:type="dxa" w:w="220"/>
+              <w:bottom w:type="dxa" w:w="160"/>
+              <w:right w:type="dxa" w:w="220"/>
+            </w:tcMar>
+          </w:tcPr>
+          <w:p>
+            <w:pPr>
+              <w:spacing w:after="80"/>
+            </w:pPr>
+            <w:r>
+              <w:rPr>
+                <w:rFonts w:ascii="Calibri" w:cs="Calibri" w:eastAsia="Calibri" w:hAnsi="Calibri"/>
+                <w:b/>
+                <w:bCs/>
+                <w:color w:val="222222"/>
+                <w:sz w:val="22"/>
+                <w:szCs w:val="22"/>
+              </w:rPr>
+              <w:t xml:space="preserve">💡 GENERATE_CONCURRENCY</w:t>
+            </w:r>
+          </w:p>
+          <w:p>
+            <w:pPr>
+              <w:spacing w:after="0" w:line="280"/>
+            </w:pPr>
+            <w:r>
+              <w:rPr>
+                <w:rFonts w:ascii="Calibri" w:cs="Calibri" w:eastAsia="Calibri" w:hAnsi="Calibri"/>
+                <w:sz w:val="22"/>
+                <w:szCs w:val="22"/>
+              </w:rPr>
+              <w:t xml:space="preserve">Ambos consumidores leen el mismo límite: Math.max(1, parseInt(process.env.GENERATE_CONCURRENCY ?? '4', 10) || 4) — default 4. Auméntalo si tienes muchas suites y quieres exprimir más el paralelismo; bájalo a 1 si notas errores 429 (rate limit) de OpenAI con muchas suites simultáneas.</w:t>
+            </w:r>
+          </w:p>
+        </w:tc>
+      </w:tr>
+    </w:tbl>
+    <w:p>
+      <w:pPr>
+        <w:spacing w:after="180" w:line="300"/>
+        <w:jc w:val="both"/>
+      </w:pPr>
+      <w:r>
+        <w:rPr>
+          <w:rFonts w:ascii="Calibri" w:cs="Calibri" w:eastAsia="Calibri" w:hAnsi="Calibri"/>
+          <w:sz w:val="22"/>
+          <w:szCs w:val="22"/>
+        </w:rPr>
+        <w:t xml:space="preserve">Verificado en vivo: al regenerar con un archivo REST y uno SOAP simultáneos en BoxAPIsExecute/, el log mostró el segundo archivo (SOAP) completando su generación ANTES que el primero (REST) que había empezado a procesarse primero — evidencia directa de ejecución concurrente, no solo teórica. npx tsc --noEmit se mantuvo en 0 errores tras el cambio.</w:t>
+      </w:r>
+    </w:p>
+    <w:p>
+      <w:pPr>
         <w:sectPr>
           <w:pgSz w:w="11907" w:h="16840" w:orient="portrait"/>
           <w:pgMar w:top="1134" w:right="1134" w:bottom="1134" w:left="1134" w:header="708" w:footer="708" w:gutter="0"/>
@@ -5679,7 +6421,7 @@
           <w:sz w:val="22"/>
           <w:szCs w:val="22"/>
         </w:rPr>
-        <w:t xml:space="preserve">Desde esta sesión, generateUITest() también resuelve datos variables (DDT) al inicio de la función (Capítulo 6):</w:t>
+        <w:t xml:space="preserve">Desde esta sesión, generateUITest() también resuelve datos variables (DDT) al inicio de la función (Capítulo 6), pidiendo explícitamente el set de datos de UI (kind='ui' — prueba &lt;Suite&gt;_Web / &lt;Suite&gt;_UI antes de caer al archivo sin sufijo):</w:t>
       </w:r>
     </w:p>
     <w:tbl>
@@ -5724,7 +6466,7 @@
                 <w:sz w:val="20"/>
                 <w:szCs w:val="20"/>
               </w:rPr>
-              <w:t xml:space="preserve">const ddtFile    = findSuiteDataFile(name);</w:t>
+              <w:t xml:space="preserve">const ddtFile    = findSuiteDataFile(name, undefined, 'ui');</w:t>
             </w:r>
           </w:p>
           <w:p>
@@ -8184,7 +8926,7 @@
                 <w:sz w:val="20"/>
                 <w:szCs w:val="20"/>
               </w:rPr>
-              <w:t xml:space="preserve">export function findSuiteDataFile(suiteName: string, dir = 'BoxTestData'): string | null</w:t>
+              <w:t xml:space="preserve">export type DataKind = 'ui' | 'rest' | 'soap';</w:t>
             </w:r>
           </w:p>
           <w:p>
@@ -8198,6 +8940,34 @@
                 <w:sz w:val="20"/>
                 <w:szCs w:val="20"/>
               </w:rPr>
+              <w:t xml:space="preserve"/>
+            </w:r>
+          </w:p>
+          <w:p>
+            <w:pPr>
+              <w:spacing w:after="0" w:line="260"/>
+            </w:pPr>
+            <w:r>
+              <w:rPr>
+                <w:rFonts w:ascii="Consolas" w:cs="Consolas" w:eastAsia="Consolas" w:hAnsi="Consolas"/>
+                <w:color w:val="F5F5F5"/>
+                <w:sz w:val="20"/>
+                <w:szCs w:val="20"/>
+              </w:rPr>
+              <w:t xml:space="preserve">export function findSuiteDataFile(suiteName: string, dir = 'BoxTestData', kind?: DataKind): string | null</w:t>
+            </w:r>
+          </w:p>
+          <w:p>
+            <w:pPr>
+              <w:spacing w:after="0" w:line="260"/>
+            </w:pPr>
+            <w:r>
+              <w:rPr>
+                <w:rFonts w:ascii="Consolas" w:cs="Consolas" w:eastAsia="Consolas" w:hAnsi="Consolas"/>
+                <w:color w:val="F5F5F5"/>
+                <w:sz w:val="20"/>
+                <w:szCs w:val="20"/>
+              </w:rPr>
               <w:t xml:space="preserve">export function parseDataFile(filePath: string): DataRow[]     // dispatcha por extensión</w:t>
             </w:r>
           </w:p>
@@ -8212,7 +8982,7 @@
                 <w:sz w:val="20"/>
                 <w:szCs w:val="20"/>
               </w:rPr>
-              <w:t xml:space="preserve">export function loadSuiteTestData(suiteName: string): DataRow[] // find + parse, [] si no hay archivo</w:t>
+              <w:t xml:space="preserve">export function loadSuiteTestData(suiteName: string, dir = 'BoxTestData', kind?: DataKind): DataRow[] // find + parse, [] si no hay archivo</w:t>
             </w:r>
           </w:p>
         </w:tc>
@@ -8381,7 +9151,7 @@
           <w:sz w:val="26"/>
           <w:szCs w:val="26"/>
         </w:rPr>
-        <w:t xml:space="preserve">6.2 ConfigurationAgents/ia-testing/agents/core/data-binding.agent.ts</w:t>
+        <w:t xml:space="preserve">6.1.1 DataKind — sets de datos separados por tipo de prueba</w:t>
       </w:r>
     </w:p>
     <w:p>
@@ -8395,7 +9165,7 @@
           <w:sz w:val="22"/>
           <w:szCs w:val="22"/>
         </w:rPr>
-        <w:t xml:space="preserve">Generaliza el patrón "match local normalizado → fallback a IA" ya usado en box-api-executor.agent.ts (findMatchingSuite/findMatchingSuiteWithAI):</w:t>
+        <w:t xml:space="preserve">Motivación: un tester necesitaba que UI y SOAP de la misma suite usaran columnas completamente distintas (Usuario/Contraseña para UI, intA/intB para el body SOAP) sin que una interfiriera con la otra. Antes de esta sesión, findSuiteDataFile() solo aceptaba &lt;Suite&gt;.ext exacto, compartido entre UI y API — no había forma de separarlos sin cambiar código.</w:t>
       </w:r>
     </w:p>
     <w:tbl>
@@ -8440,7 +9210,7 @@
                 <w:sz w:val="20"/>
                 <w:szCs w:val="20"/>
               </w:rPr>
-              <w:t xml:space="preserve">export async function matchColumnsToTargets(</w:t>
+              <w:t xml:space="preserve">const KIND_SUFFIXES: Record&lt;DataKind, string[]&gt; = {</w:t>
             </w:r>
           </w:p>
           <w:p>
@@ -8454,7 +9224,7 @@
                 <w:sz w:val="20"/>
                 <w:szCs w:val="20"/>
               </w:rPr>
-              <w:t xml:space="preserve">  headers: string[], targets: { id: string; label: string }[]</w:t>
+              <w:t xml:space="preserve">  ui:   ['_Web', '_UI'],</w:t>
             </w:r>
           </w:p>
           <w:p>
@@ -8468,7 +9238,7 @@
                 <w:sz w:val="20"/>
                 <w:szCs w:val="20"/>
               </w:rPr>
-              <w:t xml:space="preserve">): Promise&lt;Record&lt;string, string&gt;&gt;   // { columnName: targetId }</w:t>
+              <w:t xml:space="preserve">  rest: ['_REST', '_API'],</w:t>
             </w:r>
           </w:p>
           <w:p>
@@ -8482,6 +9252,34 @@
                 <w:sz w:val="20"/>
                 <w:szCs w:val="20"/>
               </w:rPr>
+              <w:t xml:space="preserve">  soap: ['_SOAP', '_API'],</w:t>
+            </w:r>
+          </w:p>
+          <w:p>
+            <w:pPr>
+              <w:spacing w:after="0" w:line="260"/>
+            </w:pPr>
+            <w:r>
+              <w:rPr>
+                <w:rFonts w:ascii="Consolas" w:cs="Consolas" w:eastAsia="Consolas" w:hAnsi="Consolas"/>
+                <w:color w:val="F5F5F5"/>
+                <w:sz w:val="20"/>
+                <w:szCs w:val="20"/>
+              </w:rPr>
+              <w:t xml:space="preserve">};</w:t>
+            </w:r>
+          </w:p>
+          <w:p>
+            <w:pPr>
+              <w:spacing w:after="0" w:line="260"/>
+            </w:pPr>
+            <w:r>
+              <w:rPr>
+                <w:rFonts w:ascii="Consolas" w:cs="Consolas" w:eastAsia="Consolas" w:hAnsi="Consolas"/>
+                <w:color w:val="F5F5F5"/>
+                <w:sz w:val="20"/>
+                <w:szCs w:val="20"/>
+              </w:rPr>
               <w:t xml:space="preserve"/>
             </w:r>
           </w:p>
@@ -8496,7 +9294,7 @@
                 <w:sz w:val="20"/>
                 <w:szCs w:val="20"/>
               </w:rPr>
-              <w:t xml:space="preserve">// 1) match exacto normalizado (sin acentos/espacios/mayúsculas)</w:t>
+              <w:t xml:space="preserve">export function findSuiteDataFile(suiteName, dir = DEFAULT_DATA_DIR, kind?: DataKind) {</w:t>
             </w:r>
           </w:p>
           <w:p>
@@ -8510,7 +9308,7 @@
                 <w:sz w:val="20"/>
                 <w:szCs w:val="20"/>
               </w:rPr>
-              <w:t xml:space="preserve">// 2) match por contención (substring en cualquier dirección)</w:t>
+              <w:t xml:space="preserve">  const suffixes = kind ? [...KIND_SUFFIXES[kind], ''] : [''];</w:t>
             </w:r>
           </w:p>
           <w:p>
@@ -8524,7 +9322,7 @@
                 <w:sz w:val="20"/>
                 <w:szCs w:val="20"/>
               </w:rPr>
-              <w:t xml:space="preserve">// 3) UNA sola llamada a gpt-4o-mini (temperature 0) para lo que quede sin resolver</w:t>
+              <w:t xml:space="preserve">  for (const suffix of suffixes) {</w:t>
             </w:r>
           </w:p>
           <w:p>
@@ -8538,7 +9336,7 @@
                 <w:sz w:val="20"/>
                 <w:szCs w:val="20"/>
               </w:rPr>
-              <w:t xml:space="preserve"/>
+              <w:t xml:space="preserve">    for (const ext of SUPPORTED_EXTENSIONS) {          // .csv → .txt → .xlsx</w:t>
             </w:r>
           </w:p>
           <w:p>
@@ -8552,7 +9350,7 @@
                 <w:sz w:val="20"/>
                 <w:szCs w:val="20"/>
               </w:rPr>
-              <w:t xml:space="preserve">export async function bindUiColumns(steps: any[], headers: string[]): Promise&lt;Record&lt;string, string&gt;&gt;</w:t>
+              <w:t xml:space="preserve">      const candidate = path.join(root, `${suiteName}${suffix}${ext}`);</w:t>
             </w:r>
           </w:p>
           <w:p>
@@ -8566,7 +9364,63 @@
                 <w:sz w:val="20"/>
                 <w:szCs w:val="20"/>
               </w:rPr>
-              <w:t xml:space="preserve">export async function bindApiColumns(bodyKeys: string[], headers: string[]): Promise&lt;Record&lt;string, string&gt;&gt;</w:t>
+              <w:t xml:space="preserve">      if (fs.existsSync(candidate)) return candidate;</w:t>
+            </w:r>
+          </w:p>
+          <w:p>
+            <w:pPr>
+              <w:spacing w:after="0" w:line="260"/>
+            </w:pPr>
+            <w:r>
+              <w:rPr>
+                <w:rFonts w:ascii="Consolas" w:cs="Consolas" w:eastAsia="Consolas" w:hAnsi="Consolas"/>
+                <w:color w:val="F5F5F5"/>
+                <w:sz w:val="20"/>
+                <w:szCs w:val="20"/>
+              </w:rPr>
+              <w:t xml:space="preserve">    }</w:t>
+            </w:r>
+          </w:p>
+          <w:p>
+            <w:pPr>
+              <w:spacing w:after="0" w:line="260"/>
+            </w:pPr>
+            <w:r>
+              <w:rPr>
+                <w:rFonts w:ascii="Consolas" w:cs="Consolas" w:eastAsia="Consolas" w:hAnsi="Consolas"/>
+                <w:color w:val="F5F5F5"/>
+                <w:sz w:val="20"/>
+                <w:szCs w:val="20"/>
+              </w:rPr>
+              <w:t xml:space="preserve">  }</w:t>
+            </w:r>
+          </w:p>
+          <w:p>
+            <w:pPr>
+              <w:spacing w:after="0" w:line="260"/>
+            </w:pPr>
+            <w:r>
+              <w:rPr>
+                <w:rFonts w:ascii="Consolas" w:cs="Consolas" w:eastAsia="Consolas" w:hAnsi="Consolas"/>
+                <w:color w:val="F5F5F5"/>
+                <w:sz w:val="20"/>
+                <w:szCs w:val="20"/>
+              </w:rPr>
+              <w:t xml:space="preserve">  return null;</w:t>
+            </w:r>
+          </w:p>
+          <w:p>
+            <w:pPr>
+              <w:spacing w:after="0" w:line="260"/>
+            </w:pPr>
+            <w:r>
+              <w:rPr>
+                <w:rFonts w:ascii="Consolas" w:cs="Consolas" w:eastAsia="Consolas" w:hAnsi="Consolas"/>
+                <w:color w:val="F5F5F5"/>
+                <w:sz w:val="20"/>
+                <w:szCs w:val="20"/>
+              </w:rPr>
+              <w:t xml:space="preserve">}</w:t>
             </w:r>
           </w:p>
         </w:tc>
@@ -8583,145 +9437,461 @@
           <w:sz w:val="22"/>
           <w:szCs w:val="22"/>
         </w:rPr>
-        <w:t xml:space="preserve">Ambas funciones invierten el resultado de </w:t>
-      </w:r>
-      <w:r>
-        <w:rPr>
-          <w:rFonts w:ascii="Consolas" w:cs="Consolas" w:eastAsia="Consolas" w:hAnsi="Consolas"/>
-          <w:color w:val="C0392B"/>
-          <w:sz w:val="20"/>
-          <w:szCs w:val="20"/>
-        </w:rPr>
-        <w:t xml:space="preserve">matchColumnsToTargets</w:t>
-      </w:r>
-      <w:r>
-        <w:rPr>
-          <w:rFonts w:ascii="Calibri" w:cs="Calibri" w:eastAsia="Calibri" w:hAnsi="Calibri"/>
-          <w:sz w:val="22"/>
-          <w:szCs w:val="22"/>
-        </w:rPr>
-        <w:t xml:space="preserve"> para devolver </w:t>
-      </w:r>
-      <w:r>
-        <w:rPr>
-          <w:rFonts w:ascii="Consolas" w:cs="Consolas" w:eastAsia="Consolas" w:hAnsi="Consolas"/>
-          <w:color w:val="C0392B"/>
-          <w:sz w:val="20"/>
-          <w:szCs w:val="20"/>
-        </w:rPr>
-        <w:t xml:space="preserve">{ stepIndex|bodyKey: columnName }</w:t>
-      </w:r>
-      <w:r>
-        <w:rPr>
-          <w:rFonts w:ascii="Calibri" w:cs="Calibri" w:eastAsia="Calibri" w:hAnsi="Calibri"/>
-          <w:sz w:val="22"/>
-          <w:szCs w:val="22"/>
-        </w:rPr>
-        <w:t xml:space="preserve">, la forma directamente útil en el sitio de sustitución. </w:t>
-      </w:r>
-      <w:r>
-        <w:rPr>
-          <w:rFonts w:ascii="Consolas" w:cs="Consolas" w:eastAsia="Consolas" w:hAnsi="Consolas"/>
-          <w:color w:val="C0392B"/>
-          <w:sz w:val="20"/>
-          <w:szCs w:val="20"/>
-        </w:rPr>
-        <w:t xml:space="preserve">bindUiColumns</w:t>
-      </w:r>
-      <w:r>
-        <w:rPr>
-          <w:rFonts w:ascii="Calibri" w:cs="Calibri" w:eastAsia="Calibri" w:hAnsi="Calibri"/>
-          <w:sz w:val="22"/>
-          <w:szCs w:val="22"/>
-        </w:rPr>
-        <w:t xml:space="preserve"> extrae la etiqueta humana del selector grabado (</w:t>
-      </w:r>
-      <w:r>
-        <w:rPr>
-          <w:rFonts w:ascii="Consolas" w:cs="Consolas" w:eastAsia="Consolas" w:hAnsi="Consolas"/>
-          <w:color w:val="C0392B"/>
-          <w:sz w:val="20"/>
-          <w:szCs w:val="20"/>
-        </w:rPr>
-        <w:t xml:space="preserve">name: '...'</w:t>
-      </w:r>
-      <w:r>
-        <w:rPr>
-          <w:rFonts w:ascii="Calibri" w:cs="Calibri" w:eastAsia="Calibri" w:hAnsi="Calibri"/>
-          <w:sz w:val="22"/>
-          <w:szCs w:val="22"/>
-        </w:rPr>
-        <w:t xml:space="preserve"> de </w:t>
-      </w:r>
-      <w:r>
-        <w:rPr>
-          <w:rFonts w:ascii="Consolas" w:cs="Consolas" w:eastAsia="Consolas" w:hAnsi="Consolas"/>
-          <w:color w:val="C0392B"/>
-          <w:sz w:val="20"/>
-          <w:szCs w:val="20"/>
-        </w:rPr>
-        <w:t xml:space="preserve">getByRole</w:t>
-      </w:r>
-      <w:r>
-        <w:rPr>
-          <w:rFonts w:ascii="Calibri" w:cs="Calibri" w:eastAsia="Calibri" w:hAnsi="Calibri"/>
-          <w:sz w:val="22"/>
-          <w:szCs w:val="22"/>
-        </w:rPr>
-        <w:t xml:space="preserve">/</w:t>
-      </w:r>
-      <w:r>
-        <w:rPr>
-          <w:rFonts w:ascii="Consolas" w:cs="Consolas" w:eastAsia="Consolas" w:hAnsi="Consolas"/>
-          <w:color w:val="C0392B"/>
-          <w:sz w:val="20"/>
-          <w:szCs w:val="20"/>
-        </w:rPr>
-        <w:t xml:space="preserve">getByLabel</w:t>
-      </w:r>
-      <w:r>
-        <w:rPr>
-          <w:rFonts w:ascii="Calibri" w:cs="Calibri" w:eastAsia="Calibri" w:hAnsi="Calibri"/>
-          <w:sz w:val="22"/>
-          <w:szCs w:val="22"/>
-        </w:rPr>
-        <w:t xml:space="preserve">/</w:t>
-      </w:r>
-      <w:r>
-        <w:rPr>
-          <w:rFonts w:ascii="Consolas" w:cs="Consolas" w:eastAsia="Consolas" w:hAnsi="Consolas"/>
-          <w:color w:val="C0392B"/>
-          <w:sz w:val="20"/>
-          <w:szCs w:val="20"/>
-        </w:rPr>
-        <w:t xml:space="preserve">getByPlaceholder</w:t>
-      </w:r>
-      <w:r>
-        <w:rPr>
-          <w:rFonts w:ascii="Calibri" w:cs="Calibri" w:eastAsia="Calibri" w:hAnsi="Calibri"/>
-          <w:sz w:val="22"/>
-          <w:szCs w:val="22"/>
-        </w:rPr>
-        <w:t xml:space="preserve">, o deriva una pseudo-etiqueta limpiando el selector crudo) — excluye explícitamente pasos con </w:t>
-      </w:r>
-      <w:r>
-        <w:rPr>
-          <w:rFonts w:ascii="Consolas" w:cs="Consolas" w:eastAsia="Consolas" w:hAnsi="Consolas"/>
-          <w:color w:val="C0392B"/>
-          <w:sz w:val="20"/>
-          <w:szCs w:val="20"/>
-        </w:rPr>
-        <w:t xml:space="preserve">step.pageRef === 'popup'</w:t>
-      </w:r>
-      <w:r>
-        <w:rPr>
-          <w:rFonts w:ascii="Calibri" w:cs="Calibri" w:eastAsia="Calibri" w:hAnsi="Calibri"/>
-          <w:sz w:val="22"/>
-          <w:szCs w:val="22"/>
-        </w:rPr>
-        <w:t xml:space="preserve"> (limitación documentada v1).</w:t>
+        <w:t xml:space="preserve">_API es intencional para rest y soap: permite un archivo compartido entre REST y SOAP que sea distinto del de UI, sin obligar a separar REST de SOAP si no hace falta. Sin kind (llamadas existentes que no lo pasan, ej. specs manuales), el comportamiento es idéntico al de antes — 100% retrocompatible.</w:t>
       </w:r>
     </w:p>
+    <w:tbl>
+      <w:tblPr>
+        <w:tblW w:type="dxa" w:w="8700"/>
+        <w:tblBorders>
+          <w:top w:val="single" w:color="auto" w:sz="4"/>
+          <w:left w:val="single" w:color="auto" w:sz="4"/>
+          <w:bottom w:val="single" w:color="auto" w:sz="4"/>
+          <w:right w:val="single" w:color="auto" w:sz="4"/>
+          <w:insideH w:val="single" w:color="auto" w:sz="4"/>
+          <w:insideV w:val="single" w:color="auto" w:sz="4"/>
+        </w:tblBorders>
+      </w:tblPr>
+      <w:tblGrid>
+        <w:gridCol w:w="1400"/>
+        <w:gridCol w:w="3000"/>
+        <w:gridCol w:w="4300"/>
+      </w:tblGrid>
+      <w:tr>
+        <w:trPr>
+          <w:tblHeader/>
+        </w:trPr>
+        <w:tc>
+          <w:tcPr>
+            <w:tcW w:type="dxa" w:w="1400"/>
+            <w:shd w:fill="1F3864" w:val="clear"/>
+            <w:tcMar>
+              <w:top w:type="dxa" w:w="100"/>
+              <w:left w:type="dxa" w:w="120"/>
+              <w:bottom w:type="dxa" w:w="100"/>
+              <w:right w:type="dxa" w:w="120"/>
+            </w:tcMar>
+            <w:vAlign w:val="center"/>
+          </w:tcPr>
+          <w:p>
+            <w:r>
+              <w:rPr>
+                <w:rFonts w:ascii="Calibri" w:cs="Calibri" w:eastAsia="Calibri" w:hAnsi="Calibri"/>
+                <w:b/>
+                <w:bCs/>
+                <w:color w:val="FFFFFF"/>
+                <w:sz w:val="20"/>
+                <w:szCs w:val="20"/>
+              </w:rPr>
+              <w:t xml:space="preserve">kind</w:t>
+            </w:r>
+          </w:p>
+        </w:tc>
+        <w:tc>
+          <w:tcPr>
+            <w:tcW w:type="dxa" w:w="3000"/>
+            <w:shd w:fill="1F3864" w:val="clear"/>
+            <w:tcMar>
+              <w:top w:type="dxa" w:w="100"/>
+              <w:left w:type="dxa" w:w="120"/>
+              <w:bottom w:type="dxa" w:w="100"/>
+              <w:right w:type="dxa" w:w="120"/>
+            </w:tcMar>
+            <w:vAlign w:val="center"/>
+          </w:tcPr>
+          <w:p>
+            <w:r>
+              <w:rPr>
+                <w:rFonts w:ascii="Calibri" w:cs="Calibri" w:eastAsia="Calibri" w:hAnsi="Calibri"/>
+                <w:b/>
+                <w:bCs/>
+                <w:color w:val="FFFFFF"/>
+                <w:sz w:val="20"/>
+                <w:szCs w:val="20"/>
+              </w:rPr>
+              <w:t xml:space="preserve">Sufijos probados (orden)</w:t>
+            </w:r>
+          </w:p>
+        </w:tc>
+        <w:tc>
+          <w:tcPr>
+            <w:tcW w:type="dxa" w:w="4300"/>
+            <w:shd w:fill="1F3864" w:val="clear"/>
+            <w:tcMar>
+              <w:top w:type="dxa" w:w="100"/>
+              <w:left w:type="dxa" w:w="120"/>
+              <w:bottom w:type="dxa" w:w="100"/>
+              <w:right w:type="dxa" w:w="120"/>
+            </w:tcMar>
+            <w:vAlign w:val="center"/>
+          </w:tcPr>
+          <w:p>
+            <w:r>
+              <w:rPr>
+                <w:rFonts w:ascii="Calibri" w:cs="Calibri" w:eastAsia="Calibri" w:hAnsi="Calibri"/>
+                <w:b/>
+                <w:bCs/>
+                <w:color w:val="FFFFFF"/>
+                <w:sz w:val="20"/>
+                <w:szCs w:val="20"/>
+              </w:rPr>
+              <w:t xml:space="preserve">Quién lo pasa</w:t>
+            </w:r>
+          </w:p>
+        </w:tc>
+      </w:tr>
+      <w:tr>
+        <w:tc>
+          <w:tcPr>
+            <w:tcW w:type="dxa" w:w="1400"/>
+            <w:shd w:fill="FFFFFF" w:val="clear"/>
+            <w:tcMar>
+              <w:top w:type="dxa" w:w="90"/>
+              <w:left w:type="dxa" w:w="120"/>
+              <w:bottom w:type="dxa" w:w="90"/>
+              <w:right w:type="dxa" w:w="120"/>
+            </w:tcMar>
+            <w:vAlign w:val="center"/>
+          </w:tcPr>
+          <w:p>
+            <w:pPr>
+              <w:spacing w:line="260"/>
+            </w:pPr>
+            <w:r>
+              <w:rPr>
+                <w:rFonts w:ascii="Consolas" w:cs="Consolas" w:eastAsia="Consolas" w:hAnsi="Consolas"/>
+                <w:color w:val="C0392B"/>
+                <w:sz w:val="20"/>
+                <w:szCs w:val="20"/>
+              </w:rPr>
+              <w:t xml:space="preserve">'ui'</w:t>
+            </w:r>
+          </w:p>
+        </w:tc>
+        <w:tc>
+          <w:tcPr>
+            <w:tcW w:type="dxa" w:w="3000"/>
+            <w:shd w:fill="FFFFFF" w:val="clear"/>
+            <w:tcMar>
+              <w:top w:type="dxa" w:w="90"/>
+              <w:left w:type="dxa" w:w="120"/>
+              <w:bottom w:type="dxa" w:w="90"/>
+              <w:right w:type="dxa" w:w="120"/>
+            </w:tcMar>
+            <w:vAlign w:val="center"/>
+          </w:tcPr>
+          <w:p>
+            <w:pPr>
+              <w:spacing w:line="260"/>
+            </w:pPr>
+            <w:r>
+              <w:rPr>
+                <w:rFonts w:ascii="Calibri" w:cs="Calibri" w:eastAsia="Calibri" w:hAnsi="Calibri"/>
+                <w:sz w:val="22"/>
+                <w:szCs w:val="22"/>
+              </w:rPr>
+              <w:t xml:space="preserve">_Web → _UI → (sin sufijo)</w:t>
+            </w:r>
+          </w:p>
+        </w:tc>
+        <w:tc>
+          <w:tcPr>
+            <w:tcW w:type="dxa" w:w="4300"/>
+            <w:shd w:fill="FFFFFF" w:val="clear"/>
+            <w:tcMar>
+              <w:top w:type="dxa" w:w="90"/>
+              <w:left w:type="dxa" w:w="120"/>
+              <w:bottom w:type="dxa" w:w="90"/>
+              <w:right w:type="dxa" w:w="120"/>
+            </w:tcMar>
+            <w:vAlign w:val="center"/>
+          </w:tcPr>
+          <w:p>
+            <w:pPr>
+              <w:spacing w:line="260"/>
+            </w:pPr>
+            <w:r>
+              <w:rPr>
+                <w:rFonts w:ascii="Consolas" w:cs="Consolas" w:eastAsia="Consolas" w:hAnsi="Consolas"/>
+                <w:color w:val="C0392B"/>
+                <w:sz w:val="20"/>
+                <w:szCs w:val="20"/>
+              </w:rPr>
+              <w:t xml:space="preserve">ui-agent.ts</w:t>
+            </w:r>
+          </w:p>
+        </w:tc>
+      </w:tr>
+      <w:tr>
+        <w:tc>
+          <w:tcPr>
+            <w:tcW w:type="dxa" w:w="1400"/>
+            <w:shd w:fill="F4F6F7" w:val="clear"/>
+            <w:tcMar>
+              <w:top w:type="dxa" w:w="90"/>
+              <w:left w:type="dxa" w:w="120"/>
+              <w:bottom w:type="dxa" w:w="90"/>
+              <w:right w:type="dxa" w:w="120"/>
+            </w:tcMar>
+            <w:vAlign w:val="center"/>
+          </w:tcPr>
+          <w:p>
+            <w:pPr>
+              <w:spacing w:line="260"/>
+            </w:pPr>
+            <w:r>
+              <w:rPr>
+                <w:rFonts w:ascii="Consolas" w:cs="Consolas" w:eastAsia="Consolas" w:hAnsi="Consolas"/>
+                <w:color w:val="C0392B"/>
+                <w:sz w:val="20"/>
+                <w:szCs w:val="20"/>
+              </w:rPr>
+              <w:t xml:space="preserve">'rest'</w:t>
+            </w:r>
+          </w:p>
+        </w:tc>
+        <w:tc>
+          <w:tcPr>
+            <w:tcW w:type="dxa" w:w="3000"/>
+            <w:shd w:fill="F4F6F7" w:val="clear"/>
+            <w:tcMar>
+              <w:top w:type="dxa" w:w="90"/>
+              <w:left w:type="dxa" w:w="120"/>
+              <w:bottom w:type="dxa" w:w="90"/>
+              <w:right w:type="dxa" w:w="120"/>
+            </w:tcMar>
+            <w:vAlign w:val="center"/>
+          </w:tcPr>
+          <w:p>
+            <w:pPr>
+              <w:spacing w:line="260"/>
+            </w:pPr>
+            <w:r>
+              <w:rPr>
+                <w:rFonts w:ascii="Calibri" w:cs="Calibri" w:eastAsia="Calibri" w:hAnsi="Calibri"/>
+                <w:sz w:val="22"/>
+                <w:szCs w:val="22"/>
+              </w:rPr>
+              <w:t xml:space="preserve">_REST → _API → (sin sufijo)</w:t>
+            </w:r>
+          </w:p>
+        </w:tc>
+        <w:tc>
+          <w:tcPr>
+            <w:tcW w:type="dxa" w:w="4300"/>
+            <w:shd w:fill="F4F6F7" w:val="clear"/>
+            <w:tcMar>
+              <w:top w:type="dxa" w:w="90"/>
+              <w:left w:type="dxa" w:w="120"/>
+              <w:bottom w:type="dxa" w:w="90"/>
+              <w:right w:type="dxa" w:w="120"/>
+            </w:tcMar>
+            <w:vAlign w:val="center"/>
+          </w:tcPr>
+          <w:p>
+            <w:pPr>
+              <w:spacing w:line="260"/>
+            </w:pPr>
+            <w:r>
+              <w:rPr>
+                <w:rFonts w:ascii="Consolas" w:cs="Consolas" w:eastAsia="Consolas" w:hAnsi="Consolas"/>
+                <w:color w:val="C0392B"/>
+                <w:sz w:val="20"/>
+                <w:szCs w:val="20"/>
+              </w:rPr>
+              <w:t xml:space="preserve">box-api-executor.agent.ts</w:t>
+            </w:r>
+            <w:r>
+              <w:rPr>
+                <w:rFonts w:ascii="Calibri" w:cs="Calibri" w:eastAsia="Calibri" w:hAnsi="Calibri"/>
+                <w:sz w:val="22"/>
+                <w:szCs w:val="22"/>
+              </w:rPr>
+              <w:t xml:space="preserve"> cuando </w:t>
+            </w:r>
+            <w:r>
+              <w:rPr>
+                <w:rFonts w:ascii="Consolas" w:cs="Consolas" w:eastAsia="Consolas" w:hAnsi="Consolas"/>
+                <w:color w:val="C0392B"/>
+                <w:sz w:val="20"/>
+                <w:szCs w:val="20"/>
+              </w:rPr>
+              <w:t xml:space="preserve">spec.serviceType === 'REST'</w:t>
+            </w:r>
+          </w:p>
+        </w:tc>
+      </w:tr>
+      <w:tr>
+        <w:tc>
+          <w:tcPr>
+            <w:tcW w:type="dxa" w:w="1400"/>
+            <w:shd w:fill="FFFFFF" w:val="clear"/>
+            <w:tcMar>
+              <w:top w:type="dxa" w:w="90"/>
+              <w:left w:type="dxa" w:w="120"/>
+              <w:bottom w:type="dxa" w:w="90"/>
+              <w:right w:type="dxa" w:w="120"/>
+            </w:tcMar>
+            <w:vAlign w:val="center"/>
+          </w:tcPr>
+          <w:p>
+            <w:pPr>
+              <w:spacing w:line="260"/>
+            </w:pPr>
+            <w:r>
+              <w:rPr>
+                <w:rFonts w:ascii="Consolas" w:cs="Consolas" w:eastAsia="Consolas" w:hAnsi="Consolas"/>
+                <w:color w:val="C0392B"/>
+                <w:sz w:val="20"/>
+                <w:szCs w:val="20"/>
+              </w:rPr>
+              <w:t xml:space="preserve">'soap'</w:t>
+            </w:r>
+          </w:p>
+        </w:tc>
+        <w:tc>
+          <w:tcPr>
+            <w:tcW w:type="dxa" w:w="3000"/>
+            <w:shd w:fill="FFFFFF" w:val="clear"/>
+            <w:tcMar>
+              <w:top w:type="dxa" w:w="90"/>
+              <w:left w:type="dxa" w:w="120"/>
+              <w:bottom w:type="dxa" w:w="90"/>
+              <w:right w:type="dxa" w:w="120"/>
+            </w:tcMar>
+            <w:vAlign w:val="center"/>
+          </w:tcPr>
+          <w:p>
+            <w:pPr>
+              <w:spacing w:line="260"/>
+            </w:pPr>
+            <w:r>
+              <w:rPr>
+                <w:rFonts w:ascii="Calibri" w:cs="Calibri" w:eastAsia="Calibri" w:hAnsi="Calibri"/>
+                <w:sz w:val="22"/>
+                <w:szCs w:val="22"/>
+              </w:rPr>
+              <w:t xml:space="preserve">_SOAP → _API → (sin sufijo)</w:t>
+            </w:r>
+          </w:p>
+        </w:tc>
+        <w:tc>
+          <w:tcPr>
+            <w:tcW w:type="dxa" w:w="4300"/>
+            <w:shd w:fill="FFFFFF" w:val="clear"/>
+            <w:tcMar>
+              <w:top w:type="dxa" w:w="90"/>
+              <w:left w:type="dxa" w:w="120"/>
+              <w:bottom w:type="dxa" w:w="90"/>
+              <w:right w:type="dxa" w:w="120"/>
+            </w:tcMar>
+            <w:vAlign w:val="center"/>
+          </w:tcPr>
+          <w:p>
+            <w:pPr>
+              <w:spacing w:line="260"/>
+            </w:pPr>
+            <w:r>
+              <w:rPr>
+                <w:rFonts w:ascii="Consolas" w:cs="Consolas" w:eastAsia="Consolas" w:hAnsi="Consolas"/>
+                <w:color w:val="C0392B"/>
+                <w:sz w:val="20"/>
+                <w:szCs w:val="20"/>
+              </w:rPr>
+              <w:t xml:space="preserve">box-api-executor.agent.ts</w:t>
+            </w:r>
+            <w:r>
+              <w:rPr>
+                <w:rFonts w:ascii="Calibri" w:cs="Calibri" w:eastAsia="Calibri" w:hAnsi="Calibri"/>
+                <w:sz w:val="22"/>
+                <w:szCs w:val="22"/>
+              </w:rPr>
+              <w:t xml:space="preserve"> cuando </w:t>
+            </w:r>
+            <w:r>
+              <w:rPr>
+                <w:rFonts w:ascii="Consolas" w:cs="Consolas" w:eastAsia="Consolas" w:hAnsi="Consolas"/>
+                <w:color w:val="C0392B"/>
+                <w:sz w:val="20"/>
+                <w:szCs w:val="20"/>
+              </w:rPr>
+              <w:t xml:space="preserve">spec.serviceType === 'SOAP'</w:t>
+            </w:r>
+          </w:p>
+        </w:tc>
+      </w:tr>
+    </w:tbl>
+    <w:tbl>
+      <w:tblPr>
+        <w:tblW w:type="pct" w:w="100%"/>
+        <w:tblBorders>
+          <w:top w:val="single" w:color="auto" w:sz="4"/>
+          <w:left w:val="single" w:color="auto" w:sz="4"/>
+          <w:bottom w:val="single" w:color="auto" w:sz="4"/>
+          <w:right w:val="single" w:color="auto" w:sz="4"/>
+          <w:insideH w:val="single" w:color="auto" w:sz="4"/>
+          <w:insideV w:val="single" w:color="auto" w:sz="4"/>
+        </w:tblBorders>
+        <w:tblCellMar>
+          <w:top w:type="dxa" w:w="160"/>
+          <w:bottom w:type="dxa" w:w="220"/>
+        </w:tblCellMar>
+      </w:tblPr>
+      <w:tblGrid>
+        <w:gridCol w:w="140"/>
+        <w:gridCol w:w="9210"/>
+      </w:tblGrid>
+      <w:tr>
+        <w:tc>
+          <w:tcPr>
+            <w:tcW w:type="dxa" w:w="140"/>
+            <w:shd w:fill="2E5C8A" w:val="clear"/>
+          </w:tcPr>
+          <w:p/>
+        </w:tc>
+        <w:tc>
+          <w:tcPr>
+            <w:tcW w:type="dxa" w:w="9210"/>
+            <w:shd w:fill="E7F1FA" w:val="clear"/>
+            <w:tcMar>
+              <w:top w:type="dxa" w:w="160"/>
+              <w:left w:type="dxa" w:w="220"/>
+              <w:bottom w:type="dxa" w:w="160"/>
+              <w:right w:type="dxa" w:w="220"/>
+            </w:tcMar>
+          </w:tcPr>
+          <w:p>
+            <w:pPr>
+              <w:spacing w:after="80"/>
+            </w:pPr>
+            <w:r>
+              <w:rPr>
+                <w:rFonts w:ascii="Calibri" w:cs="Calibri" w:eastAsia="Calibri" w:hAnsi="Calibri"/>
+                <w:b/>
+                <w:bCs/>
+                <w:color w:val="222222"/>
+                <w:sz w:val="22"/>
+                <w:szCs w:val="22"/>
+              </w:rPr>
+              <w:t xml:space="preserve">💡 Caso real verificado</w:t>
+            </w:r>
+          </w:p>
+          <w:p>
+            <w:pPr>
+              <w:spacing w:after="0" w:line="280"/>
+            </w:pPr>
+            <w:r>
+              <w:rPr>
+                <w:rFonts w:ascii="Calibri" w:cs="Calibri" w:eastAsia="Calibri" w:hAnsi="Calibri"/>
+                <w:sz w:val="22"/>
+                <w:szCs w:val="22"/>
+              </w:rPr>
+              <w:t xml:space="preserve">BoxTestData/Homebanking_Tarjeta_Virtual_Web.csv (Usuario,Contraseña) + BoxTestData/Homebanking_Tarjeta_Virtual_SOAP.csv (intA,intB) → npm run generate produjo, de forma independiente: 2 ejecuciones del flujo UI con Usuario/Contraseña, y 2 ejecuciones del test "SOAP Add - Éxito" con intA/intB (2/2 claves emparejadas). Ninguna columna de un archivo apareció en el otro.</w:t>
+            </w:r>
+          </w:p>
+        </w:tc>
+      </w:tr>
+    </w:tbl>
     <w:p>
       <w:pPr>
         <w:pStyle w:val="Heading2"/>
@@ -8735,7 +9905,7 @@
           <w:sz w:val="26"/>
           <w:szCs w:val="26"/>
         </w:rPr>
-        <w:t xml:space="preserve">6.3 Integración en ui-agent.ts</w:t>
+        <w:t xml:space="preserve">6.2 ConfigurationAgents/ia-testing/agents/core/data-binding.agent.ts</w:t>
       </w:r>
     </w:p>
     <w:p>
@@ -8743,56 +9913,13 @@
         <w:spacing w:after="180" w:line="300"/>
         <w:jc w:val="both"/>
       </w:pPr>
-      <w:r>
-        <w:rPr>
-          <w:rFonts w:ascii="Consolas" w:cs="Consolas" w:eastAsia="Consolas" w:hAnsi="Consolas"/>
-          <w:color w:val="C0392B"/>
-          <w:sz w:val="20"/>
-          <w:szCs w:val="20"/>
-        </w:rPr>
-        <w:t xml:space="preserve">generateUITest()</w:t>
-      </w:r>
       <w:r>
         <w:rPr>
           <w:rFonts w:ascii="Calibri" w:cs="Calibri" w:eastAsia="Calibri" w:hAnsi="Calibri"/>
           <w:sz w:val="22"/>
           <w:szCs w:val="22"/>
         </w:rPr>
-        <w:t xml:space="preserve"> pasó de síncrona a </w:t>
-      </w:r>
-      <w:r>
-        <w:rPr>
-          <w:rFonts w:ascii="Consolas" w:cs="Consolas" w:eastAsia="Consolas" w:hAnsi="Consolas"/>
-          <w:color w:val="C0392B"/>
-          <w:sz w:val="20"/>
-          <w:szCs w:val="20"/>
-        </w:rPr>
-        <w:t xml:space="preserve">async</w:t>
-      </w:r>
-      <w:r>
-        <w:rPr>
-          <w:rFonts w:ascii="Calibri" w:cs="Calibri" w:eastAsia="Calibri" w:hAnsi="Calibri"/>
-          <w:sz w:val="22"/>
-          <w:szCs w:val="22"/>
-        </w:rPr>
-        <w:t xml:space="preserve"> (mismo precedente que </w:t>
-      </w:r>
-      <w:r>
-        <w:rPr>
-          <w:rFonts w:ascii="Consolas" w:cs="Consolas" w:eastAsia="Consolas" w:hAnsi="Consolas"/>
-          <w:color w:val="C0392B"/>
-          <w:sz w:val="20"/>
-          <w:szCs w:val="20"/>
-        </w:rPr>
-        <w:t xml:space="preserve">generateSecurity()</w:t>
-      </w:r>
-      <w:r>
-        <w:rPr>
-          <w:rFonts w:ascii="Calibri" w:cs="Calibri" w:eastAsia="Calibri" w:hAnsi="Calibri"/>
-          <w:sz w:val="22"/>
-          <w:szCs w:val="22"/>
-        </w:rPr>
-        <w:t xml:space="preserve">, ya async y awaited). Cuando hay filas DDT, el spec generado envuelve el test original en un loop:</w:t>
+        <w:t xml:space="preserve">Generaliza el patrón "match local normalizado → fallback a IA" ya usado en box-api-executor.agent.ts (findMatchingSuite/findMatchingSuiteWithAI):</w:t>
       </w:r>
     </w:p>
     <w:tbl>
@@ -8837,7 +9964,7 @@
                 <w:sz w:val="20"/>
                 <w:szCs w:val="20"/>
               </w:rPr>
-              <w:t xml:space="preserve">const DDT_ROWS: Record&lt;string, string&gt;[] = [ /* filas embebidas como JSON literal */ ];</w:t>
+              <w:t xml:space="preserve">export async function matchColumnsToTargets(</w:t>
             </w:r>
           </w:p>
           <w:p>
@@ -8851,6 +9978,34 @@
                 <w:sz w:val="20"/>
                 <w:szCs w:val="20"/>
               </w:rPr>
+              <w:t xml:space="preserve">  headers: string[], targets: { id: string; label: string }[]</w:t>
+            </w:r>
+          </w:p>
+          <w:p>
+            <w:pPr>
+              <w:spacing w:after="0" w:line="260"/>
+            </w:pPr>
+            <w:r>
+              <w:rPr>
+                <w:rFonts w:ascii="Consolas" w:cs="Consolas" w:eastAsia="Consolas" w:hAnsi="Consolas"/>
+                <w:color w:val="F5F5F5"/>
+                <w:sz w:val="20"/>
+                <w:szCs w:val="20"/>
+              </w:rPr>
+              <w:t xml:space="preserve">): Promise&lt;Record&lt;string, string&gt;&gt;   // { columnName: targetId }</w:t>
+            </w:r>
+          </w:p>
+          <w:p>
+            <w:pPr>
+              <w:spacing w:after="0" w:line="260"/>
+            </w:pPr>
+            <w:r>
+              <w:rPr>
+                <w:rFonts w:ascii="Consolas" w:cs="Consolas" w:eastAsia="Consolas" w:hAnsi="Consolas"/>
+                <w:color w:val="F5F5F5"/>
+                <w:sz w:val="20"/>
+                <w:szCs w:val="20"/>
+              </w:rPr>
               <w:t xml:space="preserve"/>
             </w:r>
           </w:p>
@@ -8865,7 +10020,7 @@
                 <w:sz w:val="20"/>
                 <w:szCs w:val="20"/>
               </w:rPr>
-              <w:t xml:space="preserve">for (let __ddtIdx = 0; __ddtIdx &lt; DDT_ROWS.length; __ddtIdx++) {</w:t>
+              <w:t xml:space="preserve">// 1) match exacto normalizado (sin acentos/espacios/mayúsculas)</w:t>
             </w:r>
           </w:p>
           <w:p>
@@ -8879,7 +10034,7 @@
                 <w:sz w:val="20"/>
                 <w:szCs w:val="20"/>
               </w:rPr>
-              <w:t xml:space="preserve">  const __ddtRow = DDT_ROWS[__ddtIdx];</w:t>
+              <w:t xml:space="preserve">// 2) match por contención (substring en cualquier dirección)</w:t>
             </w:r>
           </w:p>
           <w:p>
@@ -8893,7 +10048,7 @@
                 <w:sz w:val="20"/>
                 <w:szCs w:val="20"/>
               </w:rPr>
-              <w:t xml:space="preserve">  test(`${name} — Fila ${__ddtIdx + 1}/${DDT_ROWS.length}`, async ({ page }) =&gt; {</w:t>
+              <w:t xml:space="preserve">// 3) UNA sola llamada a gpt-4o-mini (temperature 0) para lo que quede sin resolver</w:t>
             </w:r>
           </w:p>
           <w:p>
@@ -8907,7 +10062,7 @@
                 <w:sz w:val="20"/>
                 <w:szCs w:val="20"/>
               </w:rPr>
-              <w:t xml:space="preserve">    console.log(`@@DDT_ROW_START@@\n${JSON.stringify({row:__ddtIdx+1,total:DDT_ROWS.length,data:__ddtRow})}\n@@DDT_ROW_END@@`);</w:t>
+              <w:t xml:space="preserve"/>
             </w:r>
           </w:p>
           <w:p>
@@ -8921,7 +10076,7 @@
                 <w:sz w:val="20"/>
                 <w:szCs w:val="20"/>
               </w:rPr>
-              <w:t xml:space="preserve">    await smartGoto(page, '${name}');</w:t>
+              <w:t xml:space="preserve">export async function bindUiColumns(steps: any[], headers: string[]): Promise&lt;Record&lt;string, string&gt;&gt;</w:t>
             </w:r>
           </w:p>
           <w:p>
@@ -8935,49 +10090,7 @@
                 <w:sz w:val="20"/>
                 <w:szCs w:val="20"/>
               </w:rPr>
-              <w:t xml:space="preserve">    await smartFill(page, `...`, (__ddtRow['Monto'] ?? '10000'));  // literal original como fallback</w:t>
-            </w:r>
-          </w:p>
-          <w:p>
-            <w:pPr>
-              <w:spacing w:after="0" w:line="260"/>
-            </w:pPr>
-            <w:r>
-              <w:rPr>
-                <w:rFonts w:ascii="Consolas" w:cs="Consolas" w:eastAsia="Consolas" w:hAnsi="Consolas"/>
-                <w:color w:val="F5F5F5"/>
-                <w:sz w:val="20"/>
-                <w:szCs w:val="20"/>
-              </w:rPr>
-              <w:t xml:space="preserve">    ...</w:t>
-            </w:r>
-          </w:p>
-          <w:p>
-            <w:pPr>
-              <w:spacing w:after="0" w:line="260"/>
-            </w:pPr>
-            <w:r>
-              <w:rPr>
-                <w:rFonts w:ascii="Consolas" w:cs="Consolas" w:eastAsia="Consolas" w:hAnsi="Consolas"/>
-                <w:color w:val="F5F5F5"/>
-                <w:sz w:val="20"/>
-                <w:szCs w:val="20"/>
-              </w:rPr>
-              <w:t xml:space="preserve">  });</w:t>
-            </w:r>
-          </w:p>
-          <w:p>
-            <w:pPr>
-              <w:spacing w:after="0" w:line="260"/>
-            </w:pPr>
-            <w:r>
-              <w:rPr>
-                <w:rFonts w:ascii="Consolas" w:cs="Consolas" w:eastAsia="Consolas" w:hAnsi="Consolas"/>
-                <w:color w:val="F5F5F5"/>
-                <w:sz w:val="20"/>
-                <w:szCs w:val="20"/>
-              </w:rPr>
-              <w:t xml:space="preserve">}</w:t>
+              <w:t xml:space="preserve">export async function bindApiColumns(bodyKeys: string[], headers: string[]): Promise&lt;Record&lt;string, string&gt;&gt;</w:t>
             </w:r>
           </w:p>
         </w:tc>
@@ -8994,7 +10107,143 @@
           <w:sz w:val="22"/>
           <w:szCs w:val="22"/>
         </w:rPr>
-        <w:t xml:space="preserve">Sin archivo de datos, ddtRows.length === 0 y se genera EXACTAMENTE el spec de antes (sin loop) — el helper valueExpr(stepIndex, literal) decide, por cada step, si emite el literal grabado o la expresión __ddtRow[...] ?? literal, según exista o no un binding para ese índice.</w:t>
+        <w:t xml:space="preserve">Ambas funciones invierten el resultado de </w:t>
+      </w:r>
+      <w:r>
+        <w:rPr>
+          <w:rFonts w:ascii="Consolas" w:cs="Consolas" w:eastAsia="Consolas" w:hAnsi="Consolas"/>
+          <w:color w:val="C0392B"/>
+          <w:sz w:val="20"/>
+          <w:szCs w:val="20"/>
+        </w:rPr>
+        <w:t xml:space="preserve">matchColumnsToTargets</w:t>
+      </w:r>
+      <w:r>
+        <w:rPr>
+          <w:rFonts w:ascii="Calibri" w:cs="Calibri" w:eastAsia="Calibri" w:hAnsi="Calibri"/>
+          <w:sz w:val="22"/>
+          <w:szCs w:val="22"/>
+        </w:rPr>
+        <w:t xml:space="preserve"> para devolver </w:t>
+      </w:r>
+      <w:r>
+        <w:rPr>
+          <w:rFonts w:ascii="Consolas" w:cs="Consolas" w:eastAsia="Consolas" w:hAnsi="Consolas"/>
+          <w:color w:val="C0392B"/>
+          <w:sz w:val="20"/>
+          <w:szCs w:val="20"/>
+        </w:rPr>
+        <w:t xml:space="preserve">{ stepIndex|bodyKey: columnName }</w:t>
+      </w:r>
+      <w:r>
+        <w:rPr>
+          <w:rFonts w:ascii="Calibri" w:cs="Calibri" w:eastAsia="Calibri" w:hAnsi="Calibri"/>
+          <w:sz w:val="22"/>
+          <w:szCs w:val="22"/>
+        </w:rPr>
+        <w:t xml:space="preserve">, la forma directamente útil en el sitio de sustitución. </w:t>
+      </w:r>
+      <w:r>
+        <w:rPr>
+          <w:rFonts w:ascii="Consolas" w:cs="Consolas" w:eastAsia="Consolas" w:hAnsi="Consolas"/>
+          <w:color w:val="C0392B"/>
+          <w:sz w:val="20"/>
+          <w:szCs w:val="20"/>
+        </w:rPr>
+        <w:t xml:space="preserve">bindUiColumns</w:t>
+      </w:r>
+      <w:r>
+        <w:rPr>
+          <w:rFonts w:ascii="Calibri" w:cs="Calibri" w:eastAsia="Calibri" w:hAnsi="Calibri"/>
+          <w:sz w:val="22"/>
+          <w:szCs w:val="22"/>
+        </w:rPr>
+        <w:t xml:space="preserve"> extrae la etiqueta humana del selector grabado (</w:t>
+      </w:r>
+      <w:r>
+        <w:rPr>
+          <w:rFonts w:ascii="Consolas" w:cs="Consolas" w:eastAsia="Consolas" w:hAnsi="Consolas"/>
+          <w:color w:val="C0392B"/>
+          <w:sz w:val="20"/>
+          <w:szCs w:val="20"/>
+        </w:rPr>
+        <w:t xml:space="preserve">name: '...'</w:t>
+      </w:r>
+      <w:r>
+        <w:rPr>
+          <w:rFonts w:ascii="Calibri" w:cs="Calibri" w:eastAsia="Calibri" w:hAnsi="Calibri"/>
+          <w:sz w:val="22"/>
+          <w:szCs w:val="22"/>
+        </w:rPr>
+        <w:t xml:space="preserve"> de </w:t>
+      </w:r>
+      <w:r>
+        <w:rPr>
+          <w:rFonts w:ascii="Consolas" w:cs="Consolas" w:eastAsia="Consolas" w:hAnsi="Consolas"/>
+          <w:color w:val="C0392B"/>
+          <w:sz w:val="20"/>
+          <w:szCs w:val="20"/>
+        </w:rPr>
+        <w:t xml:space="preserve">getByRole</w:t>
+      </w:r>
+      <w:r>
+        <w:rPr>
+          <w:rFonts w:ascii="Calibri" w:cs="Calibri" w:eastAsia="Calibri" w:hAnsi="Calibri"/>
+          <w:sz w:val="22"/>
+          <w:szCs w:val="22"/>
+        </w:rPr>
+        <w:t xml:space="preserve">/</w:t>
+      </w:r>
+      <w:r>
+        <w:rPr>
+          <w:rFonts w:ascii="Consolas" w:cs="Consolas" w:eastAsia="Consolas" w:hAnsi="Consolas"/>
+          <w:color w:val="C0392B"/>
+          <w:sz w:val="20"/>
+          <w:szCs w:val="20"/>
+        </w:rPr>
+        <w:t xml:space="preserve">getByLabel</w:t>
+      </w:r>
+      <w:r>
+        <w:rPr>
+          <w:rFonts w:ascii="Calibri" w:cs="Calibri" w:eastAsia="Calibri" w:hAnsi="Calibri"/>
+          <w:sz w:val="22"/>
+          <w:szCs w:val="22"/>
+        </w:rPr>
+        <w:t xml:space="preserve">/</w:t>
+      </w:r>
+      <w:r>
+        <w:rPr>
+          <w:rFonts w:ascii="Consolas" w:cs="Consolas" w:eastAsia="Consolas" w:hAnsi="Consolas"/>
+          <w:color w:val="C0392B"/>
+          <w:sz w:val="20"/>
+          <w:szCs w:val="20"/>
+        </w:rPr>
+        <w:t xml:space="preserve">getByPlaceholder</w:t>
+      </w:r>
+      <w:r>
+        <w:rPr>
+          <w:rFonts w:ascii="Calibri" w:cs="Calibri" w:eastAsia="Calibri" w:hAnsi="Calibri"/>
+          <w:sz w:val="22"/>
+          <w:szCs w:val="22"/>
+        </w:rPr>
+        <w:t xml:space="preserve">, o deriva una pseudo-etiqueta limpiando el selector crudo) — excluye explícitamente pasos con </w:t>
+      </w:r>
+      <w:r>
+        <w:rPr>
+          <w:rFonts w:ascii="Consolas" w:cs="Consolas" w:eastAsia="Consolas" w:hAnsi="Consolas"/>
+          <w:color w:val="C0392B"/>
+          <w:sz w:val="20"/>
+          <w:szCs w:val="20"/>
+        </w:rPr>
+        <w:t xml:space="preserve">step.pageRef === 'popup'</w:t>
+      </w:r>
+      <w:r>
+        <w:rPr>
+          <w:rFonts w:ascii="Calibri" w:cs="Calibri" w:eastAsia="Calibri" w:hAnsi="Calibri"/>
+          <w:sz w:val="22"/>
+          <w:szCs w:val="22"/>
+        </w:rPr>
+        <w:t xml:space="preserve"> (limitación documentada v1).</w:t>
       </w:r>
     </w:p>
     <w:p>
@@ -9010,7 +10259,7 @@
           <w:sz w:val="26"/>
           <w:szCs w:val="26"/>
         </w:rPr>
-        <w:t xml:space="preserve">6.4 Integración en box-api-executor.agent.ts</w:t>
+        <w:t xml:space="preserve">6.3 Integración en ui-agent.ts</w:t>
       </w:r>
     </w:p>
     <w:p>
@@ -9018,15 +10267,352 @@
         <w:spacing w:after="180" w:line="300"/>
         <w:jc w:val="both"/>
       </w:pPr>
+      <w:r>
+        <w:rPr>
+          <w:rFonts w:ascii="Consolas" w:cs="Consolas" w:eastAsia="Consolas" w:hAnsi="Consolas"/>
+          <w:color w:val="C0392B"/>
+          <w:sz w:val="20"/>
+          <w:szCs w:val="20"/>
+        </w:rPr>
+        <w:t xml:space="preserve">generateUITest()</w:t>
+      </w:r>
       <w:r>
         <w:rPr>
           <w:rFonts w:ascii="Calibri" w:cs="Calibri" w:eastAsia="Calibri" w:hAnsi="Calibri"/>
           <w:sz w:val="22"/>
           <w:szCs w:val="22"/>
         </w:rPr>
-        <w:t xml:space="preserve">A diferencia de UI, el body/XML de cada fila se PRECALCULA en tiempo de generación (no en runtime) — se embebe un array de bodies ya sustituidos, más simple y más seguro que reconstruir el objeto en el spec generado:</w:t>
+        <w:t xml:space="preserve"> pasó de síncrona a </w:t>
+      </w:r>
+      <w:r>
+        <w:rPr>
+          <w:rFonts w:ascii="Consolas" w:cs="Consolas" w:eastAsia="Consolas" w:hAnsi="Consolas"/>
+          <w:color w:val="C0392B"/>
+          <w:sz w:val="20"/>
+          <w:szCs w:val="20"/>
+        </w:rPr>
+        <w:t xml:space="preserve">async</w:t>
+      </w:r>
+      <w:r>
+        <w:rPr>
+          <w:rFonts w:ascii="Calibri" w:cs="Calibri" w:eastAsia="Calibri" w:hAnsi="Calibri"/>
+          <w:sz w:val="22"/>
+          <w:szCs w:val="22"/>
+        </w:rPr>
+        <w:t xml:space="preserve"> (mismo precedente que </w:t>
+      </w:r>
+      <w:r>
+        <w:rPr>
+          <w:rFonts w:ascii="Consolas" w:cs="Consolas" w:eastAsia="Consolas" w:hAnsi="Consolas"/>
+          <w:color w:val="C0392B"/>
+          <w:sz w:val="20"/>
+          <w:szCs w:val="20"/>
+        </w:rPr>
+        <w:t xml:space="preserve">generateSecurity()</w:t>
+      </w:r>
+      <w:r>
+        <w:rPr>
+          <w:rFonts w:ascii="Calibri" w:cs="Calibri" w:eastAsia="Calibri" w:hAnsi="Calibri"/>
+          <w:sz w:val="22"/>
+          <w:szCs w:val="22"/>
+        </w:rPr>
+        <w:t xml:space="preserve">, ya async y awaited). Cuando hay filas DDT, el spec generado envuelve el test original en un loop:</w:t>
       </w:r>
     </w:p>
+    <w:tbl>
+      <w:tblPr>
+        <w:tblW w:type="pct" w:w="100%"/>
+        <w:tblBorders>
+          <w:top w:val="single" w:color="auto" w:sz="4"/>
+          <w:left w:val="single" w:color="auto" w:sz="4"/>
+          <w:bottom w:val="single" w:color="auto" w:sz="4"/>
+          <w:right w:val="single" w:color="auto" w:sz="4"/>
+          <w:insideH w:val="single" w:color="auto" w:sz="4"/>
+          <w:insideV w:val="single" w:color="auto" w:sz="4"/>
+        </w:tblBorders>
+        <w:tblCellMar>
+          <w:top w:type="dxa" w:w="100"/>
+          <w:bottom w:type="dxa" w:w="200"/>
+        </w:tblCellMar>
+      </w:tblPr>
+      <w:tblGrid>
+        <w:gridCol w:w="9350"/>
+      </w:tblGrid>
+      <w:tr>
+        <w:tc>
+          <w:tcPr>
+            <w:tcW w:type="dxa" w:w="9350"/>
+            <w:shd w:fill="2B2B2B" w:val="clear"/>
+            <w:tcMar>
+              <w:top w:type="dxa" w:w="160"/>
+              <w:left w:type="dxa" w:w="200"/>
+              <w:bottom w:type="dxa" w:w="160"/>
+              <w:right w:type="dxa" w:w="200"/>
+            </w:tcMar>
+          </w:tcPr>
+          <w:p>
+            <w:pPr>
+              <w:spacing w:after="0" w:line="260"/>
+            </w:pPr>
+            <w:r>
+              <w:rPr>
+                <w:rFonts w:ascii="Consolas" w:cs="Consolas" w:eastAsia="Consolas" w:hAnsi="Consolas"/>
+                <w:color w:val="F5F5F5"/>
+                <w:sz w:val="20"/>
+                <w:szCs w:val="20"/>
+              </w:rPr>
+              <w:t xml:space="preserve">const DDT_ROWS: Record&lt;string, string&gt;[] = [ /* filas embebidas como JSON literal */ ];</w:t>
+            </w:r>
+          </w:p>
+          <w:p>
+            <w:pPr>
+              <w:spacing w:after="0" w:line="260"/>
+            </w:pPr>
+            <w:r>
+              <w:rPr>
+                <w:rFonts w:ascii="Consolas" w:cs="Consolas" w:eastAsia="Consolas" w:hAnsi="Consolas"/>
+                <w:color w:val="F5F5F5"/>
+                <w:sz w:val="20"/>
+                <w:szCs w:val="20"/>
+              </w:rPr>
+              <w:t xml:space="preserve"/>
+            </w:r>
+          </w:p>
+          <w:p>
+            <w:pPr>
+              <w:spacing w:after="0" w:line="260"/>
+            </w:pPr>
+            <w:r>
+              <w:rPr>
+                <w:rFonts w:ascii="Consolas" w:cs="Consolas" w:eastAsia="Consolas" w:hAnsi="Consolas"/>
+                <w:color w:val="F5F5F5"/>
+                <w:sz w:val="20"/>
+                <w:szCs w:val="20"/>
+              </w:rPr>
+              <w:t xml:space="preserve">for (let __ddtIdx = 0; __ddtIdx &lt; DDT_ROWS.length; __ddtIdx++) {</w:t>
+            </w:r>
+          </w:p>
+          <w:p>
+            <w:pPr>
+              <w:spacing w:after="0" w:line="260"/>
+            </w:pPr>
+            <w:r>
+              <w:rPr>
+                <w:rFonts w:ascii="Consolas" w:cs="Consolas" w:eastAsia="Consolas" w:hAnsi="Consolas"/>
+                <w:color w:val="F5F5F5"/>
+                <w:sz w:val="20"/>
+                <w:szCs w:val="20"/>
+              </w:rPr>
+              <w:t xml:space="preserve">  const __ddtRow = DDT_ROWS[__ddtIdx];</w:t>
+            </w:r>
+          </w:p>
+          <w:p>
+            <w:pPr>
+              <w:spacing w:after="0" w:line="260"/>
+            </w:pPr>
+            <w:r>
+              <w:rPr>
+                <w:rFonts w:ascii="Consolas" w:cs="Consolas" w:eastAsia="Consolas" w:hAnsi="Consolas"/>
+                <w:color w:val="F5F5F5"/>
+                <w:sz w:val="20"/>
+                <w:szCs w:val="20"/>
+              </w:rPr>
+              <w:t xml:space="preserve">  test(`${name} — Fila ${__ddtIdx + 1}/${DDT_ROWS.length}`, async ({ page }) =&gt; {</w:t>
+            </w:r>
+          </w:p>
+          <w:p>
+            <w:pPr>
+              <w:spacing w:after="0" w:line="260"/>
+            </w:pPr>
+            <w:r>
+              <w:rPr>
+                <w:rFonts w:ascii="Consolas" w:cs="Consolas" w:eastAsia="Consolas" w:hAnsi="Consolas"/>
+                <w:color w:val="F5F5F5"/>
+                <w:sz w:val="20"/>
+                <w:szCs w:val="20"/>
+              </w:rPr>
+              <w:t xml:space="preserve">    console.log(`@@DDT_ROW_START@@\n${JSON.stringify({row:__ddtIdx+1,total:DDT_ROWS.length,data:__ddtRow})}\n@@DDT_ROW_END@@`);</w:t>
+            </w:r>
+          </w:p>
+          <w:p>
+            <w:pPr>
+              <w:spacing w:after="0" w:line="260"/>
+            </w:pPr>
+            <w:r>
+              <w:rPr>
+                <w:rFonts w:ascii="Consolas" w:cs="Consolas" w:eastAsia="Consolas" w:hAnsi="Consolas"/>
+                <w:color w:val="F5F5F5"/>
+                <w:sz w:val="20"/>
+                <w:szCs w:val="20"/>
+              </w:rPr>
+              <w:t xml:space="preserve">    await smartGoto(page, '${name}');</w:t>
+            </w:r>
+          </w:p>
+          <w:p>
+            <w:pPr>
+              <w:spacing w:after="0" w:line="260"/>
+            </w:pPr>
+            <w:r>
+              <w:rPr>
+                <w:rFonts w:ascii="Consolas" w:cs="Consolas" w:eastAsia="Consolas" w:hAnsi="Consolas"/>
+                <w:color w:val="F5F5F5"/>
+                <w:sz w:val="20"/>
+                <w:szCs w:val="20"/>
+              </w:rPr>
+              <w:t xml:space="preserve">    await smartFill(page, `...`, (__ddtRow['Monto'] ?? '10000'));  // literal original como fallback</w:t>
+            </w:r>
+          </w:p>
+          <w:p>
+            <w:pPr>
+              <w:spacing w:after="0" w:line="260"/>
+            </w:pPr>
+            <w:r>
+              <w:rPr>
+                <w:rFonts w:ascii="Consolas" w:cs="Consolas" w:eastAsia="Consolas" w:hAnsi="Consolas"/>
+                <w:color w:val="F5F5F5"/>
+                <w:sz w:val="20"/>
+                <w:szCs w:val="20"/>
+              </w:rPr>
+              <w:t xml:space="preserve">    ...</w:t>
+            </w:r>
+          </w:p>
+          <w:p>
+            <w:pPr>
+              <w:spacing w:after="0" w:line="260"/>
+            </w:pPr>
+            <w:r>
+              <w:rPr>
+                <w:rFonts w:ascii="Consolas" w:cs="Consolas" w:eastAsia="Consolas" w:hAnsi="Consolas"/>
+                <w:color w:val="F5F5F5"/>
+                <w:sz w:val="20"/>
+                <w:szCs w:val="20"/>
+              </w:rPr>
+              <w:t xml:space="preserve">  });</w:t>
+            </w:r>
+          </w:p>
+          <w:p>
+            <w:pPr>
+              <w:spacing w:after="0" w:line="260"/>
+            </w:pPr>
+            <w:r>
+              <w:rPr>
+                <w:rFonts w:ascii="Consolas" w:cs="Consolas" w:eastAsia="Consolas" w:hAnsi="Consolas"/>
+                <w:color w:val="F5F5F5"/>
+                <w:sz w:val="20"/>
+                <w:szCs w:val="20"/>
+              </w:rPr>
+              <w:t xml:space="preserve">}</w:t>
+            </w:r>
+          </w:p>
+        </w:tc>
+      </w:tr>
+    </w:tbl>
+    <w:p>
+      <w:pPr>
+        <w:spacing w:after="180" w:line="300"/>
+        <w:jc w:val="both"/>
+      </w:pPr>
+      <w:r>
+        <w:rPr>
+          <w:rFonts w:ascii="Calibri" w:cs="Calibri" w:eastAsia="Calibri" w:hAnsi="Calibri"/>
+          <w:sz w:val="22"/>
+          <w:szCs w:val="22"/>
+        </w:rPr>
+        <w:t xml:space="preserve">Sin archivo de datos, ddtRows.length === 0 y se genera EXACTAMENTE el spec de antes (sin loop) — el helper valueExpr(stepIndex, literal) decide, por cada step, si emite el literal grabado o la expresión __ddtRow[...] ?? literal, según exista o no un binding para ese índice.</w:t>
+      </w:r>
+    </w:p>
+    <w:p>
+      <w:pPr>
+        <w:pStyle w:val="Heading2"/>
+        <w:spacing w:after="160" w:before="360"/>
+      </w:pPr>
+      <w:r>
+        <w:rPr>
+          <w:b/>
+          <w:bCs/>
+          <w:color w:val="2E5C8A"/>
+          <w:sz w:val="26"/>
+          <w:szCs w:val="26"/>
+        </w:rPr>
+        <w:t xml:space="preserve">6.4 Integración en box-api-executor.agent.ts</w:t>
+      </w:r>
+    </w:p>
+    <w:p>
+      <w:pPr>
+        <w:spacing w:after="180" w:line="300"/>
+        <w:jc w:val="both"/>
+      </w:pPr>
+      <w:r>
+        <w:rPr>
+          <w:rFonts w:ascii="Calibri" w:cs="Calibri" w:eastAsia="Calibri" w:hAnsi="Calibri"/>
+          <w:sz w:val="22"/>
+          <w:szCs w:val="22"/>
+        </w:rPr>
+        <w:t xml:space="preserve">A diferencia de UI, el body/XML de cada fila se PRECALCULA en tiempo de generación (no en runtime) — se embebe un array de bodies ya sustituidos, más simple y más seguro que reconstruir el objeto en el spec generado. El archivo de datos se resuelve pidiendo kind='rest' o kind='soap' según el servicio detectado del curl/SOAP pegado:</w:t>
+      </w:r>
+    </w:p>
+    <w:tbl>
+      <w:tblPr>
+        <w:tblW w:type="pct" w:w="100%"/>
+        <w:tblBorders>
+          <w:top w:val="single" w:color="auto" w:sz="4"/>
+          <w:left w:val="single" w:color="auto" w:sz="4"/>
+          <w:bottom w:val="single" w:color="auto" w:sz="4"/>
+          <w:right w:val="single" w:color="auto" w:sz="4"/>
+          <w:insideH w:val="single" w:color="auto" w:sz="4"/>
+          <w:insideV w:val="single" w:color="auto" w:sz="4"/>
+        </w:tblBorders>
+        <w:tblCellMar>
+          <w:top w:type="dxa" w:w="100"/>
+          <w:bottom w:type="dxa" w:w="200"/>
+        </w:tblCellMar>
+      </w:tblPr>
+      <w:tblGrid>
+        <w:gridCol w:w="9350"/>
+      </w:tblGrid>
+      <w:tr>
+        <w:tc>
+          <w:tcPr>
+            <w:tcW w:type="dxa" w:w="9350"/>
+            <w:shd w:fill="2B2B2B" w:val="clear"/>
+            <w:tcMar>
+              <w:top w:type="dxa" w:w="160"/>
+              <w:left w:type="dxa" w:w="200"/>
+              <w:bottom w:type="dxa" w:w="160"/>
+              <w:right w:type="dxa" w:w="200"/>
+            </w:tcMar>
+          </w:tcPr>
+          <w:p>
+            <w:pPr>
+              <w:spacing w:after="0" w:line="260"/>
+            </w:pPr>
+            <w:r>
+              <w:rPr>
+                <w:rFonts w:ascii="Consolas" w:cs="Consolas" w:eastAsia="Consolas" w:hAnsi="Consolas"/>
+                <w:color w:val="F5F5F5"/>
+                <w:sz w:val="20"/>
+                <w:szCs w:val="20"/>
+              </w:rPr>
+              <w:t xml:space="preserve">const ddtKind: DataKind = spec.serviceType === 'SOAP' ? 'soap' : 'rest';</w:t>
+            </w:r>
+          </w:p>
+          <w:p>
+            <w:pPr>
+              <w:spacing w:after="0" w:line="260"/>
+            </w:pPr>
+            <w:r>
+              <w:rPr>
+                <w:rFonts w:ascii="Consolas" w:cs="Consolas" w:eastAsia="Consolas" w:hAnsi="Consolas"/>
+                <w:color w:val="F5F5F5"/>
+                <w:sz w:val="20"/>
+                <w:szCs w:val="20"/>
+              </w:rPr>
+              <w:t xml:space="preserve">const ddtRows = loadSuiteTestData(targetSuite, undefined, ddtKind);</w:t>
+            </w:r>
+          </w:p>
+        </w:tc>
+      </w:tr>
+    </w:tbl>
     <w:tbl>
       <w:tblPr>
         <w:tblW w:type="pct" w:w="100%"/>
@@ -14598,6 +16184,1579 @@
     </w:tbl>
     <w:p>
       <w:pPr>
+        <w:pStyle w:val="Heading2"/>
+        <w:spacing w:after="160" w:before="360"/>
+      </w:pPr>
+      <w:r>
+        <w:rPr>
+          <w:b/>
+          <w:bCs/>
+          <w:color w:val="2E5C8A"/>
+          <w:sz w:val="26"/>
+          <w:szCs w:val="26"/>
+        </w:rPr>
+        <w:t xml:space="preserve">11.3 Rediseño visual — stack de librerías vía CDN</w:t>
+      </w:r>
+    </w:p>
+    <w:p>
+      <w:pPr>
+        <w:spacing w:after="180" w:line="300"/>
+        <w:jc w:val="both"/>
+      </w:pPr>
+      <w:r>
+        <w:rPr>
+          <w:rFonts w:ascii="Calibri" w:cs="Calibri" w:eastAsia="Calibri" w:hAnsi="Calibri"/>
+          <w:sz w:val="22"/>
+          <w:szCs w:val="22"/>
+        </w:rPr>
+        <w:t xml:space="preserve">Esta sesión se rediseñó el portal por completo (inspiración Stripe/Linear/Notion: jerarquía ejecutiva, paneles minimalistas, contenido organizado en bloques) sin adoptar ningún framework de UI pesado — todo vía CDN, con degradación tolerante: si el CDN no carga (sin internet), el texto plano ya escapado sigue siendo legible, nada se rompe.</w:t>
+      </w:r>
+    </w:p>
+    <w:tbl>
+      <w:tblPr>
+        <w:tblW w:type="dxa" w:w="9250"/>
+        <w:tblBorders>
+          <w:top w:val="single" w:color="auto" w:sz="4"/>
+          <w:left w:val="single" w:color="auto" w:sz="4"/>
+          <w:bottom w:val="single" w:color="auto" w:sz="4"/>
+          <w:right w:val="single" w:color="auto" w:sz="4"/>
+          <w:insideH w:val="single" w:color="auto" w:sz="4"/>
+          <w:insideV w:val="single" w:color="auto" w:sz="4"/>
+        </w:tblBorders>
+      </w:tblPr>
+      <w:tblGrid>
+        <w:gridCol w:w="2400"/>
+        <w:gridCol w:w="4700"/>
+        <w:gridCol w:w="2150"/>
+      </w:tblGrid>
+      <w:tr>
+        <w:trPr>
+          <w:tblHeader/>
+        </w:trPr>
+        <w:tc>
+          <w:tcPr>
+            <w:tcW w:type="dxa" w:w="2400"/>
+            <w:shd w:fill="1F3864" w:val="clear"/>
+            <w:tcMar>
+              <w:top w:type="dxa" w:w="100"/>
+              <w:left w:type="dxa" w:w="120"/>
+              <w:bottom w:type="dxa" w:w="100"/>
+              <w:right w:type="dxa" w:w="120"/>
+            </w:tcMar>
+            <w:vAlign w:val="center"/>
+          </w:tcPr>
+          <w:p>
+            <w:r>
+              <w:rPr>
+                <w:rFonts w:ascii="Calibri" w:cs="Calibri" w:eastAsia="Calibri" w:hAnsi="Calibri"/>
+                <w:b/>
+                <w:bCs/>
+                <w:color w:val="FFFFFF"/>
+                <w:sz w:val="20"/>
+                <w:szCs w:val="20"/>
+              </w:rPr>
+              <w:t xml:space="preserve">Librería</w:t>
+            </w:r>
+          </w:p>
+        </w:tc>
+        <w:tc>
+          <w:tcPr>
+            <w:tcW w:type="dxa" w:w="4700"/>
+            <w:shd w:fill="1F3864" w:val="clear"/>
+            <w:tcMar>
+              <w:top w:type="dxa" w:w="100"/>
+              <w:left w:type="dxa" w:w="120"/>
+              <w:bottom w:type="dxa" w:w="100"/>
+              <w:right w:type="dxa" w:w="120"/>
+            </w:tcMar>
+            <w:vAlign w:val="center"/>
+          </w:tcPr>
+          <w:p>
+            <w:r>
+              <w:rPr>
+                <w:rFonts w:ascii="Calibri" w:cs="Calibri" w:eastAsia="Calibri" w:hAnsi="Calibri"/>
+                <w:b/>
+                <w:bCs/>
+                <w:color w:val="FFFFFF"/>
+                <w:sz w:val="20"/>
+                <w:szCs w:val="20"/>
+              </w:rPr>
+              <w:t xml:space="preserve">Uso concreto</w:t>
+            </w:r>
+          </w:p>
+        </w:tc>
+        <w:tc>
+          <w:tcPr>
+            <w:tcW w:type="dxa" w:w="2150"/>
+            <w:shd w:fill="1F3864" w:val="clear"/>
+            <w:tcMar>
+              <w:top w:type="dxa" w:w="100"/>
+              <w:left w:type="dxa" w:w="120"/>
+              <w:bottom w:type="dxa" w:w="100"/>
+              <w:right w:type="dxa" w:w="120"/>
+            </w:tcMar>
+            <w:vAlign w:val="center"/>
+          </w:tcPr>
+          <w:p>
+            <w:r>
+              <w:rPr>
+                <w:rFonts w:ascii="Calibri" w:cs="Calibri" w:eastAsia="Calibri" w:hAnsi="Calibri"/>
+                <w:b/>
+                <w:bCs/>
+                <w:color w:val="FFFFFF"/>
+                <w:sz w:val="20"/>
+                <w:szCs w:val="20"/>
+              </w:rPr>
+              <w:t xml:space="preserve">Degradación sin internet</w:t>
+            </w:r>
+          </w:p>
+        </w:tc>
+      </w:tr>
+      <w:tr>
+        <w:tc>
+          <w:tcPr>
+            <w:tcW w:type="dxa" w:w="2400"/>
+            <w:shd w:fill="FFFFFF" w:val="clear"/>
+            <w:tcMar>
+              <w:top w:type="dxa" w:w="90"/>
+              <w:left w:type="dxa" w:w="120"/>
+              <w:bottom w:type="dxa" w:w="90"/>
+              <w:right w:type="dxa" w:w="120"/>
+            </w:tcMar>
+            <w:vAlign w:val="center"/>
+          </w:tcPr>
+          <w:p>
+            <w:pPr>
+              <w:spacing w:line="260"/>
+            </w:pPr>
+            <w:r>
+              <w:rPr>
+                <w:rFonts w:ascii="Calibri" w:cs="Calibri" w:eastAsia="Calibri" w:hAnsi="Calibri"/>
+                <w:sz w:val="22"/>
+                <w:szCs w:val="22"/>
+              </w:rPr>
+              <w:t xml:space="preserve">Google Fonts (Inter + JetBrains Mono)</w:t>
+            </w:r>
+          </w:p>
+        </w:tc>
+        <w:tc>
+          <w:tcPr>
+            <w:tcW w:type="dxa" w:w="4700"/>
+            <w:shd w:fill="FFFFFF" w:val="clear"/>
+            <w:tcMar>
+              <w:top w:type="dxa" w:w="90"/>
+              <w:left w:type="dxa" w:w="120"/>
+              <w:bottom w:type="dxa" w:w="90"/>
+              <w:right w:type="dxa" w:w="120"/>
+            </w:tcMar>
+            <w:vAlign w:val="center"/>
+          </w:tcPr>
+          <w:p>
+            <w:pPr>
+              <w:spacing w:line="260"/>
+            </w:pPr>
+            <w:r>
+              <w:rPr>
+                <w:rFonts w:ascii="Calibri" w:cs="Calibri" w:eastAsia="Calibri" w:hAnsi="Calibri"/>
+                <w:sz w:val="22"/>
+                <w:szCs w:val="22"/>
+              </w:rPr>
+              <w:t xml:space="preserve">Tipografía UI (Inter) y de código/logs (JetBrains Mono), vía &lt;link&gt; en &lt;head&gt;.</w:t>
+            </w:r>
+          </w:p>
+        </w:tc>
+        <w:tc>
+          <w:tcPr>
+            <w:tcW w:type="dxa" w:w="2150"/>
+            <w:shd w:fill="FFFFFF" w:val="clear"/>
+            <w:tcMar>
+              <w:top w:type="dxa" w:w="90"/>
+              <w:left w:type="dxa" w:w="120"/>
+              <w:bottom w:type="dxa" w:w="90"/>
+              <w:right w:type="dxa" w:w="120"/>
+            </w:tcMar>
+            <w:vAlign w:val="center"/>
+          </w:tcPr>
+          <w:p>
+            <w:pPr>
+              <w:spacing w:line="260"/>
+            </w:pPr>
+            <w:r>
+              <w:rPr>
+                <w:rFonts w:ascii="Calibri" w:cs="Calibri" w:eastAsia="Calibri" w:hAnsi="Calibri"/>
+                <w:sz w:val="22"/>
+                <w:szCs w:val="22"/>
+              </w:rPr>
+              <w:t xml:space="preserve">Cae a la pila de fuentes del sistema (font-family con fallback).</w:t>
+            </w:r>
+          </w:p>
+        </w:tc>
+      </w:tr>
+      <w:tr>
+        <w:tc>
+          <w:tcPr>
+            <w:tcW w:type="dxa" w:w="2400"/>
+            <w:shd w:fill="F4F6F7" w:val="clear"/>
+            <w:tcMar>
+              <w:top w:type="dxa" w:w="90"/>
+              <w:left w:type="dxa" w:w="120"/>
+              <w:bottom w:type="dxa" w:w="90"/>
+              <w:right w:type="dxa" w:w="120"/>
+            </w:tcMar>
+            <w:vAlign w:val="center"/>
+          </w:tcPr>
+          <w:p>
+            <w:pPr>
+              <w:spacing w:line="260"/>
+            </w:pPr>
+            <w:r>
+              <w:rPr>
+                <w:rFonts w:ascii="Calibri" w:cs="Calibri" w:eastAsia="Calibri" w:hAnsi="Calibri"/>
+                <w:sz w:val="22"/>
+                <w:szCs w:val="22"/>
+              </w:rPr>
+              <w:t xml:space="preserve">Lucide (unpkg)</w:t>
+            </w:r>
+          </w:p>
+        </w:tc>
+        <w:tc>
+          <w:tcPr>
+            <w:tcW w:type="dxa" w:w="4700"/>
+            <w:shd w:fill="F4F6F7" w:val="clear"/>
+            <w:tcMar>
+              <w:top w:type="dxa" w:w="90"/>
+              <w:left w:type="dxa" w:w="120"/>
+              <w:bottom w:type="dxa" w:w="90"/>
+              <w:right w:type="dxa" w:w="120"/>
+            </w:tcMar>
+            <w:vAlign w:val="center"/>
+          </w:tcPr>
+          <w:p>
+            <w:pPr>
+              <w:spacing w:line="260"/>
+            </w:pPr>
+            <w:r>
+              <w:rPr>
+                <w:rFonts w:ascii="Calibri" w:cs="Calibri" w:eastAsia="Calibri" w:hAnsi="Calibri"/>
+                <w:sz w:val="22"/>
+                <w:szCs w:val="22"/>
+              </w:rPr>
+              <w:t xml:space="preserve">Íconos SVG en header, nav, hero, tarjetas de módulo y badges PASS/FAIL — reemplazan el emoji en las superficies ejecutivas. helper icon(name, cls) server-side emite &lt;i data-lucide="..."&gt;; lucide.createIcons() los convierte a &lt;svg&gt; en el cliente.</w:t>
+            </w:r>
+          </w:p>
+        </w:tc>
+        <w:tc>
+          <w:tcPr>
+            <w:tcW w:type="dxa" w:w="2150"/>
+            <w:shd w:fill="F4F6F7" w:val="clear"/>
+            <w:tcMar>
+              <w:top w:type="dxa" w:w="90"/>
+              <w:left w:type="dxa" w:w="120"/>
+              <w:bottom w:type="dxa" w:w="90"/>
+              <w:right w:type="dxa" w:w="120"/>
+            </w:tcMar>
+            <w:vAlign w:val="center"/>
+          </w:tcPr>
+          <w:p>
+            <w:pPr>
+              <w:spacing w:line="260"/>
+            </w:pPr>
+            <w:r>
+              <w:rPr>
+                <w:rFonts w:ascii="Calibri" w:cs="Calibri" w:eastAsia="Calibri" w:hAnsi="Calibri"/>
+                <w:sz w:val="22"/>
+                <w:szCs w:val="22"/>
+              </w:rPr>
+              <w:t xml:space="preserve">El &lt;i&gt; queda vacío (sin ícono) pero el texto junto a él sigue legible.</w:t>
+            </w:r>
+          </w:p>
+        </w:tc>
+      </w:tr>
+      <w:tr>
+        <w:tc>
+          <w:tcPr>
+            <w:tcW w:type="dxa" w:w="2400"/>
+            <w:shd w:fill="FFFFFF" w:val="clear"/>
+            <w:tcMar>
+              <w:top w:type="dxa" w:w="90"/>
+              <w:left w:type="dxa" w:w="120"/>
+              <w:bottom w:type="dxa" w:w="90"/>
+              <w:right w:type="dxa" w:w="120"/>
+            </w:tcMar>
+            <w:vAlign w:val="center"/>
+          </w:tcPr>
+          <w:p>
+            <w:pPr>
+              <w:spacing w:line="260"/>
+            </w:pPr>
+            <w:r>
+              <w:rPr>
+                <w:rFonts w:ascii="Calibri" w:cs="Calibri" w:eastAsia="Calibri" w:hAnsi="Calibri"/>
+                <w:sz w:val="22"/>
+                <w:szCs w:val="22"/>
+              </w:rPr>
+              <w:t xml:space="preserve">Animate.css</w:t>
+            </w:r>
+          </w:p>
+        </w:tc>
+        <w:tc>
+          <w:tcPr>
+            <w:tcW w:type="dxa" w:w="4700"/>
+            <w:shd w:fill="FFFFFF" w:val="clear"/>
+            <w:tcMar>
+              <w:top w:type="dxa" w:w="90"/>
+              <w:left w:type="dxa" w:w="120"/>
+              <w:bottom w:type="dxa" w:w="90"/>
+              <w:right w:type="dxa" w:w="120"/>
+            </w:tcMar>
+            <w:vAlign w:val="center"/>
+          </w:tcPr>
+          <w:p>
+            <w:pPr>
+              <w:spacing w:line="260"/>
+            </w:pPr>
+            <w:r>
+              <w:rPr>
+                <w:rFonts w:ascii="Calibri" w:cs="Calibri" w:eastAsia="Calibri" w:hAnsi="Calibri"/>
+                <w:sz w:val="22"/>
+                <w:szCs w:val="22"/>
+              </w:rPr>
+              <w:t xml:space="preserve">Entradas ligeras (fadeInUp) del header/hero/trend-card, y fade al cambiar de pestaña en showSection().</w:t>
+            </w:r>
+          </w:p>
+        </w:tc>
+        <w:tc>
+          <w:tcPr>
+            <w:tcW w:type="dxa" w:w="2150"/>
+            <w:shd w:fill="FFFFFF" w:val="clear"/>
+            <w:tcMar>
+              <w:top w:type="dxa" w:w="90"/>
+              <w:left w:type="dxa" w:w="120"/>
+              <w:bottom w:type="dxa" w:w="90"/>
+              <w:right w:type="dxa" w:w="120"/>
+            </w:tcMar>
+            <w:vAlign w:val="center"/>
+          </w:tcPr>
+          <w:p>
+            <w:pPr>
+              <w:spacing w:line="260"/>
+            </w:pPr>
+            <w:r>
+              <w:rPr>
+                <w:rFonts w:ascii="Calibri" w:cs="Calibri" w:eastAsia="Calibri" w:hAnsi="Calibri"/>
+                <w:sz w:val="22"/>
+                <w:szCs w:val="22"/>
+              </w:rPr>
+              <w:t xml:space="preserve">Sin animación — el contenido igual aparece, solo sin transición.</w:t>
+            </w:r>
+          </w:p>
+        </w:tc>
+      </w:tr>
+      <w:tr>
+        <w:tc>
+          <w:tcPr>
+            <w:tcW w:type="dxa" w:w="2400"/>
+            <w:shd w:fill="F4F6F7" w:val="clear"/>
+            <w:tcMar>
+              <w:top w:type="dxa" w:w="90"/>
+              <w:left w:type="dxa" w:w="120"/>
+              <w:bottom w:type="dxa" w:w="90"/>
+              <w:right w:type="dxa" w:w="120"/>
+            </w:tcMar>
+            <w:vAlign w:val="center"/>
+          </w:tcPr>
+          <w:p>
+            <w:pPr>
+              <w:spacing w:line="260"/>
+            </w:pPr>
+            <w:r>
+              <w:rPr>
+                <w:rFonts w:ascii="Calibri" w:cs="Calibri" w:eastAsia="Calibri" w:hAnsi="Calibri"/>
+                <w:sz w:val="22"/>
+                <w:szCs w:val="22"/>
+              </w:rPr>
+              <w:t xml:space="preserve">Prism.js (+ autoloader)</w:t>
+            </w:r>
+          </w:p>
+        </w:tc>
+        <w:tc>
+          <w:tcPr>
+            <w:tcW w:type="dxa" w:w="4700"/>
+            <w:shd w:fill="F4F6F7" w:val="clear"/>
+            <w:tcMar>
+              <w:top w:type="dxa" w:w="90"/>
+              <w:left w:type="dxa" w:w="120"/>
+              <w:bottom w:type="dxa" w:w="90"/>
+              <w:right w:type="dxa" w:w="120"/>
+            </w:tcMar>
+            <w:vAlign w:val="center"/>
+          </w:tcPr>
+          <w:p>
+            <w:pPr>
+              <w:spacing w:line="260"/>
+            </w:pPr>
+            <w:r>
+              <w:rPr>
+                <w:rFonts w:ascii="Calibri" w:cs="Calibri" w:eastAsia="Calibri" w:hAnsi="Calibri"/>
+                <w:sz w:val="22"/>
+                <w:szCs w:val="22"/>
+              </w:rPr>
+              <w:t xml:space="preserve">Resalta sintaxis JSON/XML en los paneles de request/response de la pestaña API — formatBody() ahora envuelve en &lt;code class="language-json|markup"&gt;.</w:t>
+            </w:r>
+          </w:p>
+        </w:tc>
+        <w:tc>
+          <w:tcPr>
+            <w:tcW w:type="dxa" w:w="2150"/>
+            <w:shd w:fill="F4F6F7" w:val="clear"/>
+            <w:tcMar>
+              <w:top w:type="dxa" w:w="90"/>
+              <w:left w:type="dxa" w:w="120"/>
+              <w:bottom w:type="dxa" w:w="90"/>
+              <w:right w:type="dxa" w:w="120"/>
+            </w:tcMar>
+            <w:vAlign w:val="center"/>
+          </w:tcPr>
+          <w:p>
+            <w:pPr>
+              <w:spacing w:line="260"/>
+            </w:pPr>
+            <w:r>
+              <w:rPr>
+                <w:rFonts w:ascii="Calibri" w:cs="Calibri" w:eastAsia="Calibri" w:hAnsi="Calibri"/>
+                <w:sz w:val="22"/>
+                <w:szCs w:val="22"/>
+              </w:rPr>
+              <w:t xml:space="preserve">Texto plano sin colorear, ya legible vía color:var(--text) heredado.</w:t>
+            </w:r>
+          </w:p>
+        </w:tc>
+      </w:tr>
+      <w:tr>
+        <w:tc>
+          <w:tcPr>
+            <w:tcW w:type="dxa" w:w="2400"/>
+            <w:shd w:fill="FFFFFF" w:val="clear"/>
+            <w:tcMar>
+              <w:top w:type="dxa" w:w="90"/>
+              <w:left w:type="dxa" w:w="120"/>
+              <w:bottom w:type="dxa" w:w="90"/>
+              <w:right w:type="dxa" w:w="120"/>
+            </w:tcMar>
+            <w:vAlign w:val="center"/>
+          </w:tcPr>
+          <w:p>
+            <w:pPr>
+              <w:spacing w:line="260"/>
+            </w:pPr>
+            <w:r>
+              <w:rPr>
+                <w:rFonts w:ascii="Calibri" w:cs="Calibri" w:eastAsia="Calibri" w:hAnsi="Calibri"/>
+                <w:sz w:val="22"/>
+                <w:szCs w:val="22"/>
+              </w:rPr>
+              <w:t xml:space="preserve">Highlight.js</w:t>
+            </w:r>
+          </w:p>
+        </w:tc>
+        <w:tc>
+          <w:tcPr>
+            <w:tcW w:type="dxa" w:w="4700"/>
+            <w:shd w:fill="FFFFFF" w:val="clear"/>
+            <w:tcMar>
+              <w:top w:type="dxa" w:w="90"/>
+              <w:left w:type="dxa" w:w="120"/>
+              <w:bottom w:type="dxa" w:w="90"/>
+              <w:right w:type="dxa" w:w="120"/>
+            </w:tcMar>
+            <w:vAlign w:val="center"/>
+          </w:tcPr>
+          <w:p>
+            <w:pPr>
+              <w:spacing w:line="260"/>
+            </w:pPr>
+            <w:r>
+              <w:rPr>
+                <w:rFonts w:ascii="Calibri" w:cs="Calibri" w:eastAsia="Calibri" w:hAnsi="Calibri"/>
+                <w:sz w:val="22"/>
+                <w:szCs w:val="22"/>
+              </w:rPr>
+              <w:t xml:space="preserve">Resalta los mensajes de error/stack-trace — nuevo helper renderErrorMsg() centraliza los 7 sitios que antes emitían &lt;pre class="error-msg"&gt; directo.</w:t>
+            </w:r>
+          </w:p>
+        </w:tc>
+        <w:tc>
+          <w:tcPr>
+            <w:tcW w:type="dxa" w:w="2150"/>
+            <w:shd w:fill="FFFFFF" w:val="clear"/>
+            <w:tcMar>
+              <w:top w:type="dxa" w:w="90"/>
+              <w:left w:type="dxa" w:w="120"/>
+              <w:bottom w:type="dxa" w:w="90"/>
+              <w:right w:type="dxa" w:w="120"/>
+            </w:tcMar>
+            <w:vAlign w:val="center"/>
+          </w:tcPr>
+          <w:p>
+            <w:pPr>
+              <w:spacing w:line="260"/>
+            </w:pPr>
+            <w:r>
+              <w:rPr>
+                <w:rFonts w:ascii="Calibri" w:cs="Calibri" w:eastAsia="Calibri" w:hAnsi="Calibri"/>
+                <w:sz w:val="22"/>
+                <w:szCs w:val="22"/>
+              </w:rPr>
+              <w:t xml:space="preserve">Igual — texto plano legible.</w:t>
+            </w:r>
+          </w:p>
+        </w:tc>
+      </w:tr>
+      <w:tr>
+        <w:tc>
+          <w:tcPr>
+            <w:tcW w:type="dxa" w:w="2400"/>
+            <w:shd w:fill="F4F6F7" w:val="clear"/>
+            <w:tcMar>
+              <w:top w:type="dxa" w:w="90"/>
+              <w:left w:type="dxa" w:w="120"/>
+              <w:bottom w:type="dxa" w:w="90"/>
+              <w:right w:type="dxa" w:w="120"/>
+            </w:tcMar>
+            <w:vAlign w:val="center"/>
+          </w:tcPr>
+          <w:p>
+            <w:pPr>
+              <w:spacing w:line="260"/>
+            </w:pPr>
+            <w:r>
+              <w:rPr>
+                <w:rFonts w:ascii="Calibri" w:cs="Calibri" w:eastAsia="Calibri" w:hAnsi="Calibri"/>
+                <w:sz w:val="22"/>
+                <w:szCs w:val="22"/>
+              </w:rPr>
+              <w:t xml:space="preserve">lottie-web</w:t>
+            </w:r>
+          </w:p>
+        </w:tc>
+        <w:tc>
+          <w:tcPr>
+            <w:tcW w:type="dxa" w:w="4700"/>
+            <w:shd w:fill="F4F6F7" w:val="clear"/>
+            <w:tcMar>
+              <w:top w:type="dxa" w:w="90"/>
+              <w:left w:type="dxa" w:w="120"/>
+              <w:bottom w:type="dxa" w:w="90"/>
+              <w:right w:type="dxa" w:w="120"/>
+            </w:tcMar>
+            <w:vAlign w:val="center"/>
+          </w:tcPr>
+          <w:p>
+            <w:pPr>
+              <w:spacing w:line="260"/>
+            </w:pPr>
+            <w:r>
+              <w:rPr>
+                <w:rFonts w:ascii="Calibri" w:cs="Calibri" w:eastAsia="Calibri" w:hAnsi="Calibri"/>
+                <w:sz w:val="22"/>
+                <w:szCs w:val="22"/>
+              </w:rPr>
+              <w:t xml:space="preserve">Micro-animación de pulso verde junto al estado "Todo en orden" del hero, cuando globalOk es true. JSON de animación mínimo y propio (no un asset externo) — un círculo con keyframes de escala, verificado en un navegador real antes de integrarlo (SVG renderizado, sin errores de consola).</w:t>
+            </w:r>
+          </w:p>
+        </w:tc>
+        <w:tc>
+          <w:tcPr>
+            <w:tcW w:type="dxa" w:w="2150"/>
+            <w:shd w:fill="F4F6F7" w:val="clear"/>
+            <w:tcMar>
+              <w:top w:type="dxa" w:w="90"/>
+              <w:left w:type="dxa" w:w="120"/>
+              <w:bottom w:type="dxa" w:w="90"/>
+              <w:right w:type="dxa" w:w="120"/>
+            </w:tcMar>
+            <w:vAlign w:val="center"/>
+          </w:tcPr>
+          <w:p>
+            <w:pPr>
+              <w:spacing w:line="260"/>
+            </w:pPr>
+            <w:r>
+              <w:rPr>
+                <w:rFonts w:ascii="Calibri" w:cs="Calibri" w:eastAsia="Calibri" w:hAnsi="Calibri"/>
+                <w:sz w:val="22"/>
+                <w:szCs w:val="22"/>
+              </w:rPr>
+              <w:t xml:space="preserve">Sin animación — el texto "Todo en orden" se ve igual.</w:t>
+            </w:r>
+          </w:p>
+        </w:tc>
+      </w:tr>
+      <w:tr>
+        <w:tc>
+          <w:tcPr>
+            <w:tcW w:type="dxa" w:w="2400"/>
+            <w:shd w:fill="FFFFFF" w:val="clear"/>
+            <w:tcMar>
+              <w:top w:type="dxa" w:w="90"/>
+              <w:left w:type="dxa" w:w="120"/>
+              <w:bottom w:type="dxa" w:w="90"/>
+              <w:right w:type="dxa" w:w="120"/>
+            </w:tcMar>
+            <w:vAlign w:val="center"/>
+          </w:tcPr>
+          <w:p>
+            <w:pPr>
+              <w:spacing w:line="260"/>
+            </w:pPr>
+            <w:r>
+              <w:rPr>
+                <w:rFonts w:ascii="Calibri" w:cs="Calibri" w:eastAsia="Calibri" w:hAnsi="Calibri"/>
+                <w:sz w:val="22"/>
+                <w:szCs w:val="22"/>
+              </w:rPr>
+              <w:t xml:space="preserve">Chart.js</w:t>
+            </w:r>
+          </w:p>
+        </w:tc>
+        <w:tc>
+          <w:tcPr>
+            <w:tcW w:type="dxa" w:w="4700"/>
+            <w:shd w:fill="FFFFFF" w:val="clear"/>
+            <w:tcMar>
+              <w:top w:type="dxa" w:w="90"/>
+              <w:left w:type="dxa" w:w="120"/>
+              <w:bottom w:type="dxa" w:w="90"/>
+              <w:right w:type="dxa" w:w="120"/>
+            </w:tcMar>
+            <w:vAlign w:val="center"/>
+          </w:tcPr>
+          <w:p>
+            <w:pPr>
+              <w:spacing w:line="260"/>
+            </w:pPr>
+            <w:r>
+              <w:rPr>
+                <w:rFonts w:ascii="Calibri" w:cs="Calibri" w:eastAsia="Calibri" w:hAnsi="Calibri"/>
+                <w:sz w:val="22"/>
+                <w:szCs w:val="22"/>
+              </w:rPr>
+              <w:t xml:space="preserve">Ya existente — ahora reskin con tokens del nuevo sistema de diseño (Capítulo 11.4) y re-render en toggle de tema (chartTheme()).</w:t>
+            </w:r>
+          </w:p>
+        </w:tc>
+        <w:tc>
+          <w:tcPr>
+            <w:tcW w:type="dxa" w:w="2150"/>
+            <w:shd w:fill="FFFFFF" w:val="clear"/>
+            <w:tcMar>
+              <w:top w:type="dxa" w:w="90"/>
+              <w:left w:type="dxa" w:w="120"/>
+              <w:bottom w:type="dxa" w:w="90"/>
+              <w:right w:type="dxa" w:w="120"/>
+            </w:tcMar>
+            <w:vAlign w:val="center"/>
+          </w:tcPr>
+          <w:p>
+            <w:pPr>
+              <w:spacing w:line="260"/>
+            </w:pPr>
+            <w:r>
+              <w:rPr>
+                <w:rFonts w:ascii="Calibri" w:cs="Calibri" w:eastAsia="Calibri" w:hAnsi="Calibri"/>
+                <w:sz w:val="22"/>
+                <w:szCs w:val="22"/>
+              </w:rPr>
+              <w:t xml:space="preserve">N/A — ya documentado en versión previa del manual.</w:t>
+            </w:r>
+          </w:p>
+        </w:tc>
+      </w:tr>
+    </w:tbl>
+    <w:p>
+      <w:pPr>
+        <w:pStyle w:val="Heading2"/>
+        <w:spacing w:after="160" w:before="360"/>
+      </w:pPr>
+      <w:r>
+        <w:rPr>
+          <w:b/>
+          <w:bCs/>
+          <w:color w:val="2E5C8A"/>
+          <w:sz w:val="26"/>
+          <w:szCs w:val="26"/>
+        </w:rPr>
+        <w:t xml:space="preserve">11.4 Sistema de temas — claro por defecto, oscuro opcional</w:t>
+      </w:r>
+    </w:p>
+    <w:p>
+      <w:pPr>
+        <w:spacing w:after="180" w:line="300"/>
+        <w:jc w:val="both"/>
+      </w:pPr>
+      <w:r>
+        <w:rPr>
+          <w:rFonts w:ascii="Calibri" w:cs="Calibri" w:eastAsia="Calibri" w:hAnsi="Calibri"/>
+          <w:sz w:val="22"/>
+          <w:szCs w:val="22"/>
+        </w:rPr>
+        <w:t xml:space="preserve">Todo el CSS usa variables custom properties centralizadas en :root, con un override :root[data-theme="dark"] para el modo oscuro. A diferencia de la primera versión de esta funcionalidad (donde el oscuro era el default y el claro era el override), esta sesión INVIRTIÓ el default: el tema base (sin atributo) es ahora un claro profesional (#f7f8fb / superficie #ffffff / texto #161a2c), pensado para proyectarse o imprimirse ante gerencia. El oscuro queda como opción vía el botón 🌙/☀️ del header.</w:t>
+      </w:r>
+    </w:p>
+    <w:tbl>
+      <w:tblPr>
+        <w:tblW w:type="pct" w:w="100%"/>
+        <w:tblBorders>
+          <w:top w:val="single" w:color="auto" w:sz="4"/>
+          <w:left w:val="single" w:color="auto" w:sz="4"/>
+          <w:bottom w:val="single" w:color="auto" w:sz="4"/>
+          <w:right w:val="single" w:color="auto" w:sz="4"/>
+          <w:insideH w:val="single" w:color="auto" w:sz="4"/>
+          <w:insideV w:val="single" w:color="auto" w:sz="4"/>
+        </w:tblBorders>
+        <w:tblCellMar>
+          <w:top w:type="dxa" w:w="100"/>
+          <w:bottom w:type="dxa" w:w="200"/>
+        </w:tblCellMar>
+      </w:tblPr>
+      <w:tblGrid>
+        <w:gridCol w:w="9350"/>
+      </w:tblGrid>
+      <w:tr>
+        <w:tc>
+          <w:tcPr>
+            <w:tcW w:type="dxa" w:w="9350"/>
+            <w:shd w:fill="2B2B2B" w:val="clear"/>
+            <w:tcMar>
+              <w:top w:type="dxa" w:w="160"/>
+              <w:left w:type="dxa" w:w="200"/>
+              <w:bottom w:type="dxa" w:w="160"/>
+              <w:right w:type="dxa" w:w="200"/>
+            </w:tcMar>
+          </w:tcPr>
+          <w:p>
+            <w:pPr>
+              <w:spacing w:after="0" w:line="260"/>
+            </w:pPr>
+            <w:r>
+              <w:rPr>
+                <w:rFonts w:ascii="Consolas" w:cs="Consolas" w:eastAsia="Consolas" w:hAnsi="Consolas"/>
+                <w:color w:val="F5F5F5"/>
+                <w:sz w:val="20"/>
+                <w:szCs w:val="20"/>
+              </w:rPr>
+              <w:t xml:space="preserve">:root {</w:t>
+            </w:r>
+          </w:p>
+          <w:p>
+            <w:pPr>
+              <w:spacing w:after="0" w:line="260"/>
+            </w:pPr>
+            <w:r>
+              <w:rPr>
+                <w:rFonts w:ascii="Consolas" w:cs="Consolas" w:eastAsia="Consolas" w:hAnsi="Consolas"/>
+                <w:color w:val="F5F5F5"/>
+                <w:sz w:val="20"/>
+                <w:szCs w:val="20"/>
+              </w:rPr>
+              <w:t xml:space="preserve">  --bg:#f7f8fb; --surface:#ffffff; --text:#161a2c; --muted:#5c6478;</w:t>
+            </w:r>
+          </w:p>
+          <w:p>
+            <w:pPr>
+              <w:spacing w:after="0" w:line="260"/>
+            </w:pPr>
+            <w:r>
+              <w:rPr>
+                <w:rFonts w:ascii="Consolas" w:cs="Consolas" w:eastAsia="Consolas" w:hAnsi="Consolas"/>
+                <w:color w:val="F5F5F5"/>
+                <w:sz w:val="20"/>
+                <w:szCs w:val="20"/>
+              </w:rPr>
+              <w:t xml:space="preserve">  --accent:#6366f1; --accent-2:#8b5cf6; --accent-3:#06b6d4;</w:t>
+            </w:r>
+          </w:p>
+          <w:p>
+            <w:pPr>
+              <w:spacing w:after="0" w:line="260"/>
+            </w:pPr>
+            <w:r>
+              <w:rPr>
+                <w:rFonts w:ascii="Consolas" w:cs="Consolas" w:eastAsia="Consolas" w:hAnsi="Consolas"/>
+                <w:color w:val="F5F5F5"/>
+                <w:sz w:val="20"/>
+                <w:szCs w:val="20"/>
+              </w:rPr>
+              <w:t xml:space="preserve">  --gradient-brand: linear-gradient(135deg,var(--accent) 0%,var(--accent-2) 55%,var(--accent-3) 100%);</w:t>
+            </w:r>
+          </w:p>
+          <w:p>
+            <w:pPr>
+              <w:spacing w:after="0" w:line="260"/>
+            </w:pPr>
+            <w:r>
+              <w:rPr>
+                <w:rFonts w:ascii="Consolas" w:cs="Consolas" w:eastAsia="Consolas" w:hAnsi="Consolas"/>
+                <w:color w:val="F5F5F5"/>
+                <w:sz w:val="20"/>
+                <w:szCs w:val="20"/>
+              </w:rPr>
+              <w:t xml:space="preserve">  --glass-bg: rgba(255,255,255,.78); --glass-blur: 16px;</w:t>
+            </w:r>
+          </w:p>
+          <w:p>
+            <w:pPr>
+              <w:spacing w:after="0" w:line="260"/>
+            </w:pPr>
+            <w:r>
+              <w:rPr>
+                <w:rFonts w:ascii="Consolas" w:cs="Consolas" w:eastAsia="Consolas" w:hAnsi="Consolas"/>
+                <w:color w:val="F5F5F5"/>
+                <w:sz w:val="20"/>
+                <w:szCs w:val="20"/>
+              </w:rPr>
+              <w:t xml:space="preserve">  --tint: rgba(16,24,64,.045);   // overlay sutil para hover/código — adaptado por tema</w:t>
+            </w:r>
+          </w:p>
+          <w:p>
+            <w:pPr>
+              <w:spacing w:after="0" w:line="260"/>
+            </w:pPr>
+            <w:r>
+              <w:rPr>
+                <w:rFonts w:ascii="Consolas" w:cs="Consolas" w:eastAsia="Consolas" w:hAnsi="Consolas"/>
+                <w:color w:val="F5F5F5"/>
+                <w:sz w:val="20"/>
+                <w:szCs w:val="20"/>
+              </w:rPr>
+              <w:t xml:space="preserve">}</w:t>
+            </w:r>
+          </w:p>
+          <w:p>
+            <w:pPr>
+              <w:spacing w:after="0" w:line="260"/>
+            </w:pPr>
+            <w:r>
+              <w:rPr>
+                <w:rFonts w:ascii="Consolas" w:cs="Consolas" w:eastAsia="Consolas" w:hAnsi="Consolas"/>
+                <w:color w:val="F5F5F5"/>
+                <w:sz w:val="20"/>
+                <w:szCs w:val="20"/>
+              </w:rPr>
+              <w:t xml:space="preserve">:root[data-theme="dark"] {</w:t>
+            </w:r>
+          </w:p>
+          <w:p>
+            <w:pPr>
+              <w:spacing w:after="0" w:line="260"/>
+            </w:pPr>
+            <w:r>
+              <w:rPr>
+                <w:rFonts w:ascii="Consolas" w:cs="Consolas" w:eastAsia="Consolas" w:hAnsi="Consolas"/>
+                <w:color w:val="F5F5F5"/>
+                <w:sz w:val="20"/>
+                <w:szCs w:val="20"/>
+              </w:rPr>
+              <w:t xml:space="preserve">  --bg:#0b0d16; --surface:#12141f; --text:#eef1fb; --muted:#8891a8;</w:t>
+            </w:r>
+          </w:p>
+          <w:p>
+            <w:pPr>
+              <w:spacing w:after="0" w:line="260"/>
+            </w:pPr>
+            <w:r>
+              <w:rPr>
+                <w:rFonts w:ascii="Consolas" w:cs="Consolas" w:eastAsia="Consolas" w:hAnsi="Consolas"/>
+                <w:color w:val="F5F5F5"/>
+                <w:sz w:val="20"/>
+                <w:szCs w:val="20"/>
+              </w:rPr>
+              <w:t xml:space="preserve">  --glass-bg: rgba(18,20,31,.72); --tint: rgba(255,255,255,.05);</w:t>
+            </w:r>
+          </w:p>
+          <w:p>
+            <w:pPr>
+              <w:spacing w:after="0" w:line="260"/>
+            </w:pPr>
+            <w:r>
+              <w:rPr>
+                <w:rFonts w:ascii="Consolas" w:cs="Consolas" w:eastAsia="Consolas" w:hAnsi="Consolas"/>
+                <w:color w:val="F5F5F5"/>
+                <w:sz w:val="20"/>
+                <w:szCs w:val="20"/>
+              </w:rPr>
+              <w:t xml:space="preserve">}</w:t>
+            </w:r>
+          </w:p>
+        </w:tc>
+      </w:tr>
+    </w:tbl>
+    <w:p>
+      <w:pPr>
+        <w:spacing w:after="180" w:line="300"/>
+        <w:jc w:val="both"/>
+      </w:pPr>
+      <w:r>
+        <w:rPr>
+          <w:rFonts w:ascii="Calibri" w:cs="Calibri" w:eastAsia="Calibri" w:hAnsi="Calibri"/>
+          <w:sz w:val="22"/>
+          <w:szCs w:val="22"/>
+        </w:rPr>
+        <w:t xml:space="preserve">Anti-flash: un &lt;script&gt; síncrono en &lt;head&gt; (antes del &lt;style&gt;) lee localStorage.getItem('qaPortalTheme') y, si es 'dark', aplica document.documentElement.setAttribute('data-theme','dark') ANTES del primer paint — evita el parpadeo claro→oscuro que ocurriría si el tema se aplicara después de renderizar. toggleTheme() (al final del &lt;script&gt; principal) invierte el atributo, persiste la preferencia, y llama reThemeCharts() para re-dibujar cualquier gráfico Chart.js activo con los colores del nuevo tema.</w:t>
+      </w:r>
+    </w:p>
+    <w:tbl>
+      <w:tblPr>
+        <w:tblW w:type="pct" w:w="100%"/>
+        <w:tblBorders>
+          <w:top w:val="single" w:color="auto" w:sz="4"/>
+          <w:left w:val="single" w:color="auto" w:sz="4"/>
+          <w:bottom w:val="single" w:color="auto" w:sz="4"/>
+          <w:right w:val="single" w:color="auto" w:sz="4"/>
+          <w:insideH w:val="single" w:color="auto" w:sz="4"/>
+          <w:insideV w:val="single" w:color="auto" w:sz="4"/>
+        </w:tblBorders>
+        <w:tblCellMar>
+          <w:top w:type="dxa" w:w="160"/>
+          <w:bottom w:type="dxa" w:w="220"/>
+        </w:tblCellMar>
+      </w:tblPr>
+      <w:tblGrid>
+        <w:gridCol w:w="140"/>
+        <w:gridCol w:w="9210"/>
+      </w:tblGrid>
+      <w:tr>
+        <w:tc>
+          <w:tcPr>
+            <w:tcW w:type="dxa" w:w="140"/>
+            <w:shd w:fill="B03A2E" w:val="clear"/>
+          </w:tcPr>
+          <w:p/>
+        </w:tc>
+        <w:tc>
+          <w:tcPr>
+            <w:tcW w:type="dxa" w:w="9210"/>
+            <w:shd w:fill="FDEDEC" w:val="clear"/>
+            <w:tcMar>
+              <w:top w:type="dxa" w:w="160"/>
+              <w:left w:type="dxa" w:w="220"/>
+              <w:bottom w:type="dxa" w:w="160"/>
+              <w:right w:type="dxa" w:w="220"/>
+            </w:tcMar>
+          </w:tcPr>
+          <w:p>
+            <w:pPr>
+              <w:spacing w:after="80"/>
+            </w:pPr>
+            <w:r>
+              <w:rPr>
+                <w:rFonts w:ascii="Calibri" w:cs="Calibri" w:eastAsia="Calibri" w:hAnsi="Calibri"/>
+                <w:b/>
+                <w:bCs/>
+                <w:color w:val="222222"/>
+                <w:sz w:val="22"/>
+                <w:szCs w:val="22"/>
+              </w:rPr>
+              <w:t xml:space="preserve">⚠ Bug real encontrado y corregido durante el rediseño</w:t>
+            </w:r>
+          </w:p>
+          <w:p>
+            <w:pPr>
+              <w:spacing w:after="0" w:line="280"/>
+            </w:pPr>
+            <w:r>
+              <w:rPr>
+                <w:rFonts w:ascii="Calibri" w:cs="Calibri" w:eastAsia="Calibri" w:hAnsi="Calibri"/>
+                <w:sz w:val="22"/>
+                <w:szCs w:val="22"/>
+              </w:rPr>
+              <w:t xml:space="preserve">.header tenía un fondo oscuro fijo (rgba(17,24,39,.85)) que no respondía al cambio de tema — quedó así desde la primera versión del tema claro. Se corrigió a background:var(--glass-bg). También el círculo de fondo del donut SVG (usado en las tarjetas de módulo) tenía un azul marino fijo (#1e2538) — se corrigió a stroke="var(--border)" (los atributos de presentación SVG SÍ resuelven custom properties CSS cuando el SVG es inline). Y ~15 clases de texto (.card-label, .mod-title, .suite-name, etc.) tenían color:#fff fijo — invisibles sobre fondo claro — se corrigieron a var(--text), dejando intactos los casos donde blanco fijo es correcto (texto sobre botones/badges de color, el lightbox de capturas que siempre es oscuro).</w:t>
+            </w:r>
+          </w:p>
+        </w:tc>
+      </w:tr>
+    </w:tbl>
+    <w:p>
+      <w:pPr>
+        <w:pStyle w:val="Heading2"/>
+        <w:spacing w:after="160" w:before="360"/>
+      </w:pPr>
+      <w:r>
+        <w:rPr>
+          <w:b/>
+          <w:bCs/>
+          <w:color w:val="2E5C8A"/>
+          <w:sz w:val="26"/>
+          <w:szCs w:val="26"/>
+        </w:rPr>
+        <w:t xml:space="preserve">11.5 Hero ejecutivo, tendencia histórica y exportación PDF</w:t>
+      </w:r>
+    </w:p>
+    <w:p>
+      <w:pPr>
+        <w:spacing w:after="180" w:line="300"/>
+        <w:jc w:val="both"/>
+      </w:pPr>
+      <w:r>
+        <w:rPr>
+          <w:rFonts w:ascii="Calibri" w:cs="Calibri" w:eastAsia="Calibri" w:hAnsi="Calibri"/>
+          <w:sz w:val="22"/>
+          <w:szCs w:val="22"/>
+        </w:rPr>
+        <w:t xml:space="preserve">Nuevas piezas agregadas en el rediseño, todas en la pestaña "📊 Resumen":</w:t>
+      </w:r>
+    </w:p>
+    <w:tbl>
+      <w:tblPr>
+        <w:tblW w:type="dxa" w:w="9250"/>
+        <w:tblBorders>
+          <w:top w:val="single" w:color="auto" w:sz="4"/>
+          <w:left w:val="single" w:color="auto" w:sz="4"/>
+          <w:bottom w:val="single" w:color="auto" w:sz="4"/>
+          <w:right w:val="single" w:color="auto" w:sz="4"/>
+          <w:insideH w:val="single" w:color="auto" w:sz="4"/>
+          <w:insideV w:val="single" w:color="auto" w:sz="4"/>
+        </w:tblBorders>
+      </w:tblPr>
+      <w:tblGrid>
+        <w:gridCol w:w="1800"/>
+        <w:gridCol w:w="2600"/>
+        <w:gridCol w:w="4850"/>
+      </w:tblGrid>
+      <w:tr>
+        <w:trPr>
+          <w:tblHeader/>
+        </w:trPr>
+        <w:tc>
+          <w:tcPr>
+            <w:tcW w:type="dxa" w:w="1800"/>
+            <w:shd w:fill="1F3864" w:val="clear"/>
+            <w:tcMar>
+              <w:top w:type="dxa" w:w="100"/>
+              <w:left w:type="dxa" w:w="120"/>
+              <w:bottom w:type="dxa" w:w="100"/>
+              <w:right w:type="dxa" w:w="120"/>
+            </w:tcMar>
+            <w:vAlign w:val="center"/>
+          </w:tcPr>
+          <w:p>
+            <w:r>
+              <w:rPr>
+                <w:rFonts w:ascii="Calibri" w:cs="Calibri" w:eastAsia="Calibri" w:hAnsi="Calibri"/>
+                <w:b/>
+                <w:bCs/>
+                <w:color w:val="FFFFFF"/>
+                <w:sz w:val="20"/>
+                <w:szCs w:val="20"/>
+              </w:rPr>
+              <w:t xml:space="preserve">Pieza</w:t>
+            </w:r>
+          </w:p>
+        </w:tc>
+        <w:tc>
+          <w:tcPr>
+            <w:tcW w:type="dxa" w:w="2600"/>
+            <w:shd w:fill="1F3864" w:val="clear"/>
+            <w:tcMar>
+              <w:top w:type="dxa" w:w="100"/>
+              <w:left w:type="dxa" w:w="120"/>
+              <w:bottom w:type="dxa" w:w="100"/>
+              <w:right w:type="dxa" w:w="120"/>
+            </w:tcMar>
+            <w:vAlign w:val="center"/>
+          </w:tcPr>
+          <w:p>
+            <w:r>
+              <w:rPr>
+                <w:rFonts w:ascii="Calibri" w:cs="Calibri" w:eastAsia="Calibri" w:hAnsi="Calibri"/>
+                <w:b/>
+                <w:bCs/>
+                <w:color w:val="FFFFFF"/>
+                <w:sz w:val="20"/>
+                <w:szCs w:val="20"/>
+              </w:rPr>
+              <w:t xml:space="preserve">Función</w:t>
+            </w:r>
+          </w:p>
+        </w:tc>
+        <w:tc>
+          <w:tcPr>
+            <w:tcW w:type="dxa" w:w="4850"/>
+            <w:shd w:fill="1F3864" w:val="clear"/>
+            <w:tcMar>
+              <w:top w:type="dxa" w:w="100"/>
+              <w:left w:type="dxa" w:w="120"/>
+              <w:bottom w:type="dxa" w:w="100"/>
+              <w:right w:type="dxa" w:w="120"/>
+            </w:tcMar>
+            <w:vAlign w:val="center"/>
+          </w:tcPr>
+          <w:p>
+            <w:r>
+              <w:rPr>
+                <w:rFonts w:ascii="Calibri" w:cs="Calibri" w:eastAsia="Calibri" w:hAnsi="Calibri"/>
+                <w:b/>
+                <w:bCs/>
+                <w:color w:val="FFFFFF"/>
+                <w:sz w:val="20"/>
+                <w:szCs w:val="20"/>
+              </w:rPr>
+              <w:t xml:space="preserve">Detalle</w:t>
+            </w:r>
+          </w:p>
+        </w:tc>
+      </w:tr>
+      <w:tr>
+        <w:tc>
+          <w:tcPr>
+            <w:tcW w:type="dxa" w:w="1800"/>
+            <w:shd w:fill="FFFFFF" w:val="clear"/>
+            <w:tcMar>
+              <w:top w:type="dxa" w:w="90"/>
+              <w:left w:type="dxa" w:w="120"/>
+              <w:bottom w:type="dxa" w:w="90"/>
+              <w:right w:type="dxa" w:w="120"/>
+            </w:tcMar>
+            <w:vAlign w:val="center"/>
+          </w:tcPr>
+          <w:p>
+            <w:pPr>
+              <w:spacing w:line="260"/>
+            </w:pPr>
+            <w:r>
+              <w:rPr>
+                <w:rFonts w:ascii="Calibri" w:cs="Calibri" w:eastAsia="Calibri" w:hAnsi="Calibri"/>
+                <w:sz w:val="22"/>
+                <w:szCs w:val="22"/>
+              </w:rPr>
+              <w:t xml:space="preserve">Hero KPI</w:t>
+            </w:r>
+          </w:p>
+        </w:tc>
+        <w:tc>
+          <w:tcPr>
+            <w:tcW w:type="dxa" w:w="2600"/>
+            <w:shd w:fill="FFFFFF" w:val="clear"/>
+            <w:tcMar>
+              <w:top w:type="dxa" w:w="90"/>
+              <w:left w:type="dxa" w:w="120"/>
+              <w:bottom w:type="dxa" w:w="90"/>
+              <w:right w:type="dxa" w:w="120"/>
+            </w:tcMar>
+            <w:vAlign w:val="center"/>
+          </w:tcPr>
+          <w:p>
+            <w:pPr>
+              <w:spacing w:line="260"/>
+            </w:pPr>
+            <w:r>
+              <w:rPr>
+                <w:rFonts w:ascii="Consolas" w:cs="Consolas" w:eastAsia="Consolas" w:hAnsi="Consolas"/>
+                <w:color w:val="C0392B"/>
+                <w:sz w:val="20"/>
+                <w:szCs w:val="20"/>
+              </w:rPr>
+              <w:t xml:space="preserve">computeGlobalDiagnosis(groups, totals)</w:t>
+            </w:r>
+          </w:p>
+        </w:tc>
+        <w:tc>
+          <w:tcPr>
+            <w:tcW w:type="dxa" w:w="4850"/>
+            <w:shd w:fill="FFFFFF" w:val="clear"/>
+            <w:tcMar>
+              <w:top w:type="dxa" w:w="90"/>
+              <w:left w:type="dxa" w:w="120"/>
+              <w:bottom w:type="dxa" w:w="90"/>
+              <w:right w:type="dxa" w:w="120"/>
+            </w:tcMar>
+            <w:vAlign w:val="center"/>
+          </w:tcPr>
+          <w:p>
+            <w:pPr>
+              <w:spacing w:line="260"/>
+            </w:pPr>
+            <w:r>
+              <w:rPr>
+                <w:rFonts w:ascii="Calibri" w:cs="Calibri" w:eastAsia="Calibri" w:hAnsi="Calibri"/>
+                <w:sz w:val="22"/>
+                <w:szCs w:val="22"/>
+              </w:rPr>
+              <w:t xml:space="preserve">Mismo patrón que computeOverallDiagnosis() del PNF (11.2), aplicado a TODO el reporte: genera una narrativa tipo "3 módulos con fallas, ordenados por severidad: ..." listando los módulos con más fallos, en vez de solo números sueltos.</w:t>
+            </w:r>
+          </w:p>
+        </w:tc>
+      </w:tr>
+      <w:tr>
+        <w:tc>
+          <w:tcPr>
+            <w:tcW w:type="dxa" w:w="1800"/>
+            <w:shd w:fill="F4F6F7" w:val="clear"/>
+            <w:tcMar>
+              <w:top w:type="dxa" w:w="90"/>
+              <w:left w:type="dxa" w:w="120"/>
+              <w:bottom w:type="dxa" w:w="90"/>
+              <w:right w:type="dxa" w:w="120"/>
+            </w:tcMar>
+            <w:vAlign w:val="center"/>
+          </w:tcPr>
+          <w:p>
+            <w:pPr>
+              <w:spacing w:line="260"/>
+            </w:pPr>
+            <w:r>
+              <w:rPr>
+                <w:rFonts w:ascii="Calibri" w:cs="Calibri" w:eastAsia="Calibri" w:hAnsi="Calibri"/>
+                <w:sz w:val="22"/>
+                <w:szCs w:val="22"/>
+              </w:rPr>
+              <w:t xml:space="preserve">Tendencia histórica</w:t>
+            </w:r>
+          </w:p>
+        </w:tc>
+        <w:tc>
+          <w:tcPr>
+            <w:tcW w:type="dxa" w:w="2600"/>
+            <w:shd w:fill="F4F6F7" w:val="clear"/>
+            <w:tcMar>
+              <w:top w:type="dxa" w:w="90"/>
+              <w:left w:type="dxa" w:w="120"/>
+              <w:bottom w:type="dxa" w:w="90"/>
+              <w:right w:type="dxa" w:w="120"/>
+            </w:tcMar>
+            <w:vAlign w:val="center"/>
+          </w:tcPr>
+          <w:p>
+            <w:pPr>
+              <w:spacing w:line="260"/>
+            </w:pPr>
+            <w:r>
+              <w:rPr>
+                <w:rFonts w:ascii="Consolas" w:cs="Consolas" w:eastAsia="Consolas" w:hAnsi="Consolas"/>
+                <w:color w:val="C0392B"/>
+                <w:sz w:val="20"/>
+                <w:szCs w:val="20"/>
+              </w:rPr>
+              <w:t xml:space="preserve">.report-history.json</w:t>
+            </w:r>
+            <w:r>
+              <w:rPr>
+                <w:rFonts w:ascii="Calibri" w:cs="Calibri" w:eastAsia="Calibri" w:hAnsi="Calibri"/>
+                <w:sz w:val="22"/>
+                <w:szCs w:val="22"/>
+              </w:rPr>
+              <w:t xml:space="preserve"> (raíz del proyecto, gitignorado)</w:t>
+            </w:r>
+          </w:p>
+        </w:tc>
+        <w:tc>
+          <w:tcPr>
+            <w:tcW w:type="dxa" w:w="4850"/>
+            <w:shd w:fill="F4F6F7" w:val="clear"/>
+            <w:tcMar>
+              <w:top w:type="dxa" w:w="90"/>
+              <w:left w:type="dxa" w:w="120"/>
+              <w:bottom w:type="dxa" w:w="90"/>
+              <w:right w:type="dxa" w:w="120"/>
+            </w:tcMar>
+            <w:vAlign w:val="center"/>
+          </w:tcPr>
+          <w:p>
+            <w:pPr>
+              <w:spacing w:line="260"/>
+            </w:pPr>
+            <w:r>
+              <w:rPr>
+                <w:rFonts w:ascii="Calibri" w:cs="Calibri" w:eastAsia="Calibri" w:hAnsi="Calibri"/>
+                <w:sz w:val="22"/>
+                <w:szCs w:val="22"/>
+              </w:rPr>
+              <w:t xml:space="preserve">Cada corrida de generate-portal.js hace append de { date, rate, tests, failures, branch, commit } (máx. 20 entradas) si totals.tests &gt; 0. renderTrendCard() solo aparece desde la 2ª ejecución — un gráfico Chart.js de línea con el % de éxito de las últimas N corridas locales.</w:t>
+            </w:r>
+          </w:p>
+        </w:tc>
+      </w:tr>
+      <w:tr>
+        <w:tc>
+          <w:tcPr>
+            <w:tcW w:type="dxa" w:w="1800"/>
+            <w:shd w:fill="FFFFFF" w:val="clear"/>
+            <w:tcMar>
+              <w:top w:type="dxa" w:w="90"/>
+              <w:left w:type="dxa" w:w="120"/>
+              <w:bottom w:type="dxa" w:w="90"/>
+              <w:right w:type="dxa" w:w="120"/>
+            </w:tcMar>
+            <w:vAlign w:val="center"/>
+          </w:tcPr>
+          <w:p>
+            <w:pPr>
+              <w:spacing w:line="260"/>
+            </w:pPr>
+            <w:r>
+              <w:rPr>
+                <w:rFonts w:ascii="Calibri" w:cs="Calibri" w:eastAsia="Calibri" w:hAnsi="Calibri"/>
+                <w:sz w:val="22"/>
+                <w:szCs w:val="22"/>
+              </w:rPr>
+              <w:t xml:space="preserve">Contexto de la corrida</w:t>
+            </w:r>
+          </w:p>
+        </w:tc>
+        <w:tc>
+          <w:tcPr>
+            <w:tcW w:type="dxa" w:w="2600"/>
+            <w:shd w:fill="FFFFFF" w:val="clear"/>
+            <w:tcMar>
+              <w:top w:type="dxa" w:w="90"/>
+              <w:left w:type="dxa" w:w="120"/>
+              <w:bottom w:type="dxa" w:w="90"/>
+              <w:right w:type="dxa" w:w="120"/>
+            </w:tcMar>
+            <w:vAlign w:val="center"/>
+          </w:tcPr>
+          <w:p>
+            <w:pPr>
+              <w:spacing w:line="260"/>
+            </w:pPr>
+            <w:r>
+              <w:rPr>
+                <w:rFonts w:ascii="Consolas" w:cs="Consolas" w:eastAsia="Consolas" w:hAnsi="Consolas"/>
+                <w:color w:val="C0392B"/>
+                <w:sz w:val="20"/>
+                <w:szCs w:val="20"/>
+              </w:rPr>
+              <w:t xml:space="preserve">getGitInfo()</w:t>
+            </w:r>
+            <w:r>
+              <w:rPr>
+                <w:rFonts w:ascii="Calibri" w:cs="Calibri" w:eastAsia="Calibri" w:hAnsi="Calibri"/>
+                <w:sz w:val="22"/>
+                <w:szCs w:val="22"/>
+              </w:rPr>
+              <w:t xml:space="preserve"> / </w:t>
+            </w:r>
+            <w:r>
+              <w:rPr>
+                <w:rFonts w:ascii="Consolas" w:cs="Consolas" w:eastAsia="Consolas" w:hAnsi="Consolas"/>
+                <w:color w:val="C0392B"/>
+                <w:sz w:val="20"/>
+                <w:szCs w:val="20"/>
+              </w:rPr>
+              <w:t xml:space="preserve">getEnvironmentLabel()</w:t>
+            </w:r>
+          </w:p>
+        </w:tc>
+        <w:tc>
+          <w:tcPr>
+            <w:tcW w:type="dxa" w:w="4850"/>
+            <w:shd w:fill="FFFFFF" w:val="clear"/>
+            <w:tcMar>
+              <w:top w:type="dxa" w:w="90"/>
+              <w:left w:type="dxa" w:w="120"/>
+              <w:bottom w:type="dxa" w:w="90"/>
+              <w:right w:type="dxa" w:w="120"/>
+            </w:tcMar>
+            <w:vAlign w:val="center"/>
+          </w:tcPr>
+          <w:p>
+            <w:pPr>
+              <w:spacing w:line="260"/>
+            </w:pPr>
+            <w:r>
+              <w:rPr>
+                <w:rFonts w:ascii="Calibri" w:cs="Calibri" w:eastAsia="Calibri" w:hAnsi="Calibri"/>
+                <w:sz w:val="22"/>
+                <w:szCs w:val="22"/>
+              </w:rPr>
+              <w:t xml:space="preserve">Rama y commit (execSync git rev-parse, best-effort — nunca lanza si no es repo git) + baseURL leído de GenerateTest/*.metadata.json, mostrados en el header.</w:t>
+            </w:r>
+          </w:p>
+        </w:tc>
+      </w:tr>
+      <w:tr>
+        <w:tc>
+          <w:tcPr>
+            <w:tcW w:type="dxa" w:w="1800"/>
+            <w:shd w:fill="F4F6F7" w:val="clear"/>
+            <w:tcMar>
+              <w:top w:type="dxa" w:w="90"/>
+              <w:left w:type="dxa" w:w="120"/>
+              <w:bottom w:type="dxa" w:w="90"/>
+              <w:right w:type="dxa" w:w="120"/>
+            </w:tcMar>
+            <w:vAlign w:val="center"/>
+          </w:tcPr>
+          <w:p>
+            <w:pPr>
+              <w:spacing w:line="260"/>
+            </w:pPr>
+            <w:r>
+              <w:rPr>
+                <w:rFonts w:ascii="Calibri" w:cs="Calibri" w:eastAsia="Calibri" w:hAnsi="Calibri"/>
+                <w:sz w:val="22"/>
+                <w:szCs w:val="22"/>
+              </w:rPr>
+              <w:t xml:space="preserve">PDF del Resumen Ejecutivo</w:t>
+            </w:r>
+          </w:p>
+        </w:tc>
+        <w:tc>
+          <w:tcPr>
+            <w:tcW w:type="dxa" w:w="2600"/>
+            <w:shd w:fill="F4F6F7" w:val="clear"/>
+            <w:tcMar>
+              <w:top w:type="dxa" w:w="90"/>
+              <w:left w:type="dxa" w:w="120"/>
+              <w:bottom w:type="dxa" w:w="90"/>
+              <w:right w:type="dxa" w:w="120"/>
+            </w:tcMar>
+            <w:vAlign w:val="center"/>
+          </w:tcPr>
+          <w:p>
+            <w:pPr>
+              <w:spacing w:line="260"/>
+            </w:pPr>
+            <w:r>
+              <w:rPr>
+                <w:rFonts w:ascii="Consolas" w:cs="Consolas" w:eastAsia="Consolas" w:hAnsi="Consolas"/>
+                <w:color w:val="C0392B"/>
+                <w:sz w:val="20"/>
+                <w:szCs w:val="20"/>
+              </w:rPr>
+              <w:t xml:space="preserve">downloadExecPdf()</w:t>
+            </w:r>
+          </w:p>
+        </w:tc>
+        <w:tc>
+          <w:tcPr>
+            <w:tcW w:type="dxa" w:w="4850"/>
+            <w:shd w:fill="F4F6F7" w:val="clear"/>
+            <w:tcMar>
+              <w:top w:type="dxa" w:w="90"/>
+              <w:left w:type="dxa" w:w="120"/>
+              <w:bottom w:type="dxa" w:w="90"/>
+              <w:right w:type="dxa" w:w="120"/>
+            </w:tcMar>
+            <w:vAlign w:val="center"/>
+          </w:tcPr>
+          <w:p>
+            <w:pPr>
+              <w:spacing w:line="260"/>
+            </w:pPr>
+            <w:r>
+              <w:rPr>
+                <w:rFonts w:ascii="Calibri" w:cs="Calibri" w:eastAsia="Calibri" w:hAnsi="Calibri"/>
+                <w:sz w:val="22"/>
+                <w:szCs w:val="22"/>
+              </w:rPr>
+              <w:t xml:space="preserve">Mismo patrón jsPDF + html2canvas que ya existía solo para el PNF (downloadPnfPdf()) — ahora también exportable para toda la pestaña Resumen. Ambos leen getComputedStyle(document.body).getPropertyValue('--bg') para que el fondo del PDF coincida con el tema activo (antes tenían un hex oscuro fijo).</w:t>
+            </w:r>
+          </w:p>
+        </w:tc>
+      </w:tr>
+    </w:tbl>
+    <w:p>
+      <w:pPr>
+        <w:spacing w:after="180" w:line="300"/>
+        <w:jc w:val="both"/>
+      </w:pPr>
+      <w:r>
+        <w:rPr>
+          <w:rFonts w:ascii="Calibri" w:cs="Calibri" w:eastAsia="Calibri" w:hAnsi="Calibri"/>
+          <w:sz w:val="22"/>
+          <w:szCs w:val="22"/>
+        </w:rPr>
+        <w:t xml:space="preserve">Bug real corregido durante la verificación: </w:t>
+      </w:r>
+      <w:r>
+        <w:rPr>
+          <w:rFonts w:ascii="Consolas" w:cs="Consolas" w:eastAsia="Consolas" w:hAnsi="Consolas"/>
+          <w:color w:val="C0392B"/>
+          <w:sz w:val="20"/>
+          <w:szCs w:val="20"/>
+        </w:rPr>
+        <w:t xml:space="preserve">initTrendChart()</w:t>
+      </w:r>
+      <w:r>
+        <w:rPr>
+          <w:rFonts w:ascii="Calibri" w:cs="Calibri" w:eastAsia="Calibri" w:hAnsi="Calibri"/>
+          <w:sz w:val="22"/>
+          <w:szCs w:val="22"/>
+        </w:rPr>
+        <w:t xml:space="preserve"> se llamaba de forma síncrona en </w:t>
+      </w:r>
+      <w:r>
+        <w:rPr>
+          <w:rFonts w:ascii="Consolas" w:cs="Consolas" w:eastAsia="Consolas" w:hAnsi="Consolas"/>
+          <w:color w:val="C0392B"/>
+          <w:sz w:val="20"/>
+          <w:szCs w:val="20"/>
+        </w:rPr>
+        <w:t xml:space="preserve">DOMContentLoaded</w:t>
+      </w:r>
+      <w:r>
+        <w:rPr>
+          <w:rFonts w:ascii="Calibri" w:cs="Calibri" w:eastAsia="Calibri" w:hAnsi="Calibri"/>
+          <w:sz w:val="22"/>
+          <w:szCs w:val="22"/>
+        </w:rPr>
+        <w:t xml:space="preserve">, antes de que el layout del contenedor terminara — Chart.js inicializaba el canvas con ancho 0. Se corrigió con el mismo patrón de retardo que ya usaban los gráficos PNF: </w:t>
+      </w:r>
+      <w:r>
+        <w:rPr>
+          <w:rFonts w:ascii="Consolas" w:cs="Consolas" w:eastAsia="Consolas" w:hAnsi="Consolas"/>
+          <w:color w:val="C0392B"/>
+          <w:sz w:val="20"/>
+          <w:szCs w:val="20"/>
+        </w:rPr>
+        <w:t xml:space="preserve">setTimeout(initTrendChart, 120)</w:t>
+      </w:r>
+      <w:r>
+        <w:rPr>
+          <w:rFonts w:ascii="Calibri" w:cs="Calibri" w:eastAsia="Calibri" w:hAnsi="Calibri"/>
+          <w:sz w:val="22"/>
+          <w:szCs w:val="22"/>
+        </w:rPr>
+        <w:t xml:space="preserve">. Confirmado en navegador real: el canvas pasó de </w:t>
+      </w:r>
+      <w:r>
+        <w:rPr>
+          <w:rFonts w:ascii="Consolas" w:cs="Consolas" w:eastAsia="Consolas" w:hAnsi="Consolas"/>
+          <w:color w:val="C0392B"/>
+          <w:sz w:val="20"/>
+          <w:szCs w:val="20"/>
+        </w:rPr>
+        <w:t xml:space="preserve">width:0</w:t>
+      </w:r>
+      <w:r>
+        <w:rPr>
+          <w:rFonts w:ascii="Calibri" w:cs="Calibri" w:eastAsia="Calibri" w:hAnsi="Calibri"/>
+          <w:sz w:val="22"/>
+          <w:szCs w:val="22"/>
+        </w:rPr>
+        <w:t xml:space="preserve"> a </w:t>
+      </w:r>
+      <w:r>
+        <w:rPr>
+          <w:rFonts w:ascii="Consolas" w:cs="Consolas" w:eastAsia="Consolas" w:hAnsi="Consolas"/>
+          <w:color w:val="C0392B"/>
+          <w:sz w:val="20"/>
+          <w:szCs w:val="20"/>
+        </w:rPr>
+        <w:t xml:space="preserve">width:1119px</w:t>
+      </w:r>
+      <w:r>
+        <w:rPr>
+          <w:rFonts w:ascii="Calibri" w:cs="Calibri" w:eastAsia="Calibri" w:hAnsi="Calibri"/>
+          <w:sz w:val="22"/>
+          <w:szCs w:val="22"/>
+        </w:rPr>
+        <w:t xml:space="preserve"> con la instancia de Chart.js activa.</w:t>
+      </w:r>
+    </w:p>
+    <w:p>
+      <w:pPr>
         <w:sectPr>
           <w:pgSz w:w="11907" w:h="16840" w:orient="portrait"/>
           <w:pgMar w:top="1134" w:right="1134" w:bottom="1134" w:left="1134" w:header="708" w:footer="708" w:gutter="0"/>
@@ -16499,7 +19658,7 @@
                 <w:sz w:val="20"/>
                 <w:szCs w:val="20"/>
               </w:rPr>
-              <w:t xml:space="preserve">BoxTestData/&lt;Suite&gt;.*</w:t>
+              <w:t xml:space="preserve">BoxTestData/&lt;Suite&gt;[_Web|_UI|_REST|_SOAP|_API].*</w:t>
             </w:r>
           </w:p>
         </w:tc>
@@ -16551,7 +19710,7 @@
                 <w:sz w:val="22"/>
                 <w:szCs w:val="22"/>
               </w:rPr>
-              <w:t xml:space="preserve">Editar el archivo de datos + npm run generate.</w:t>
+              <w:t xml:space="preserve">Editar el archivo de datos + npm run generate. Sufijo opcional para separar el set de UI del de REST/SOAP (Capítulo 6.1.1).</w:t>
             </w:r>
           </w:p>
         </w:tc>
@@ -16659,6 +19818,237 @@
                 <w:szCs w:val="22"/>
               </w:rPr>
               <w:t xml:space="preserve">Constantes de código — afecta TODAS las suites, no por-suite.</w:t>
+            </w:r>
+          </w:p>
+        </w:tc>
+      </w:tr>
+      <w:tr>
+        <w:tc>
+          <w:tcPr>
+            <w:tcW w:type="dxa" w:w="1600"/>
+            <w:shd w:fill="F4F6F7" w:val="clear"/>
+            <w:tcMar>
+              <w:top w:type="dxa" w:w="90"/>
+              <w:left w:type="dxa" w:w="120"/>
+              <w:bottom w:type="dxa" w:w="90"/>
+              <w:right w:type="dxa" w:w="120"/>
+            </w:tcMar>
+            <w:vAlign w:val="center"/>
+          </w:tcPr>
+          <w:p>
+            <w:pPr>
+              <w:spacing w:line="260"/>
+            </w:pPr>
+            <w:r>
+              <w:rPr>
+                <w:rFonts w:ascii="Calibri" w:cs="Calibri" w:eastAsia="Calibri" w:hAnsi="Calibri"/>
+                <w:sz w:val="22"/>
+                <w:szCs w:val="22"/>
+              </w:rPr>
+              <w:t xml:space="preserve">Concurrencia de generación</w:t>
+            </w:r>
+          </w:p>
+        </w:tc>
+        <w:tc>
+          <w:tcPr>
+            <w:tcW w:type="dxa" w:w="2400"/>
+            <w:shd w:fill="F4F6F7" w:val="clear"/>
+            <w:tcMar>
+              <w:top w:type="dxa" w:w="90"/>
+              <w:left w:type="dxa" w:w="120"/>
+              <w:bottom w:type="dxa" w:w="90"/>
+              <w:right w:type="dxa" w:w="120"/>
+            </w:tcMar>
+            <w:vAlign w:val="center"/>
+          </w:tcPr>
+          <w:p>
+            <w:pPr>
+              <w:spacing w:line="260"/>
+            </w:pPr>
+            <w:r>
+              <w:rPr>
+                <w:rFonts w:ascii="Consolas" w:cs="Consolas" w:eastAsia="Consolas" w:hAnsi="Consolas"/>
+                <w:color w:val="C0392B"/>
+                <w:sz w:val="20"/>
+                <w:szCs w:val="20"/>
+              </w:rPr>
+              <w:t xml:space="preserve">GENERATE_CONCURRENCY</w:t>
+            </w:r>
+          </w:p>
+        </w:tc>
+        <w:tc>
+          <w:tcPr>
+            <w:tcW w:type="dxa" w:w="1800"/>
+            <w:shd w:fill="F4F6F7" w:val="clear"/>
+            <w:tcMar>
+              <w:top w:type="dxa" w:w="90"/>
+              <w:left w:type="dxa" w:w="120"/>
+              <w:bottom w:type="dxa" w:w="90"/>
+              <w:right w:type="dxa" w:w="120"/>
+            </w:tcMar>
+            <w:vAlign w:val="center"/>
+          </w:tcPr>
+          <w:p>
+            <w:pPr>
+              <w:spacing w:line="260"/>
+            </w:pPr>
+            <w:r>
+              <w:rPr>
+                <w:rFonts w:ascii="Calibri" w:cs="Calibri" w:eastAsia="Calibri" w:hAnsi="Calibri"/>
+                <w:sz w:val="22"/>
+                <w:szCs w:val="22"/>
+              </w:rPr>
+              <w:t xml:space="preserve">N/A (variable de entorno)</w:t>
+            </w:r>
+          </w:p>
+        </w:tc>
+        <w:tc>
+          <w:tcPr>
+            <w:tcW w:type="dxa" w:w="3450"/>
+            <w:shd w:fill="F4F6F7" w:val="clear"/>
+            <w:tcMar>
+              <w:top w:type="dxa" w:w="90"/>
+              <w:left w:type="dxa" w:w="120"/>
+              <w:bottom w:type="dxa" w:w="90"/>
+              <w:right w:type="dxa" w:w="120"/>
+            </w:tcMar>
+            <w:vAlign w:val="center"/>
+          </w:tcPr>
+          <w:p>
+            <w:pPr>
+              <w:spacing w:line="260"/>
+            </w:pPr>
+            <w:r>
+              <w:rPr>
+                <w:rFonts w:ascii="Calibri" w:cs="Calibri" w:eastAsia="Calibri" w:hAnsi="Calibri"/>
+                <w:sz w:val="22"/>
+                <w:szCs w:val="22"/>
+              </w:rPr>
+              <w:t xml:space="preserve">Límite de suites/archivos procesados en paralelo durante npm run generate (default 4) — Capítulo 3.2.</w:t>
+            </w:r>
+          </w:p>
+        </w:tc>
+      </w:tr>
+      <w:tr>
+        <w:tc>
+          <w:tcPr>
+            <w:tcW w:type="dxa" w:w="1600"/>
+            <w:shd w:fill="FFFFFF" w:val="clear"/>
+            <w:tcMar>
+              <w:top w:type="dxa" w:w="90"/>
+              <w:left w:type="dxa" w:w="120"/>
+              <w:bottom w:type="dxa" w:w="90"/>
+              <w:right w:type="dxa" w:w="120"/>
+            </w:tcMar>
+            <w:vAlign w:val="center"/>
+          </w:tcPr>
+          <w:p>
+            <w:pPr>
+              <w:spacing w:line="260"/>
+            </w:pPr>
+            <w:r>
+              <w:rPr>
+                <w:rFonts w:ascii="Calibri" w:cs="Calibri" w:eastAsia="Calibri" w:hAnsi="Calibri"/>
+                <w:sz w:val="22"/>
+                <w:szCs w:val="22"/>
+              </w:rPr>
+              <w:t xml:space="preserve">Tema del reporte</w:t>
+            </w:r>
+          </w:p>
+        </w:tc>
+        <w:tc>
+          <w:tcPr>
+            <w:tcW w:type="dxa" w:w="2400"/>
+            <w:shd w:fill="FFFFFF" w:val="clear"/>
+            <w:tcMar>
+              <w:top w:type="dxa" w:w="90"/>
+              <w:left w:type="dxa" w:w="120"/>
+              <w:bottom w:type="dxa" w:w="90"/>
+              <w:right w:type="dxa" w:w="120"/>
+            </w:tcMar>
+            <w:vAlign w:val="center"/>
+          </w:tcPr>
+          <w:p>
+            <w:pPr>
+              <w:spacing w:line="260"/>
+            </w:pPr>
+            <w:r>
+              <w:rPr>
+                <w:rFonts w:ascii="Consolas" w:cs="Consolas" w:eastAsia="Consolas" w:hAnsi="Consolas"/>
+                <w:color w:val="C0392B"/>
+                <w:sz w:val="20"/>
+                <w:szCs w:val="20"/>
+              </w:rPr>
+              <w:t xml:space="preserve">generate-portal.js</w:t>
+            </w:r>
+            <w:r>
+              <w:rPr>
+                <w:rFonts w:ascii="Calibri" w:cs="Calibri" w:eastAsia="Calibri" w:hAnsi="Calibri"/>
+                <w:sz w:val="22"/>
+                <w:szCs w:val="22"/>
+              </w:rPr>
+              <w:t xml:space="preserve"> — bloque </w:t>
+            </w:r>
+            <w:r>
+              <w:rPr>
+                <w:rFonts w:ascii="Consolas" w:cs="Consolas" w:eastAsia="Consolas" w:hAnsi="Consolas"/>
+                <w:color w:val="C0392B"/>
+                <w:sz w:val="20"/>
+                <w:szCs w:val="20"/>
+              </w:rPr>
+              <w:t xml:space="preserve">:root</w:t>
+            </w:r>
+          </w:p>
+        </w:tc>
+        <w:tc>
+          <w:tcPr>
+            <w:tcW w:type="dxa" w:w="1800"/>
+            <w:shd w:fill="FFFFFF" w:val="clear"/>
+            <w:tcMar>
+              <w:top w:type="dxa" w:w="90"/>
+              <w:left w:type="dxa" w:w="120"/>
+              <w:bottom w:type="dxa" w:w="90"/>
+              <w:right w:type="dxa" w:w="120"/>
+            </w:tcMar>
+            <w:vAlign w:val="center"/>
+          </w:tcPr>
+          <w:p>
+            <w:pPr>
+              <w:spacing w:line="260"/>
+            </w:pPr>
+            <w:r>
+              <w:rPr>
+                <w:rFonts w:ascii="Calibri" w:cs="Calibri" w:eastAsia="Calibri" w:hAnsi="Calibri"/>
+                <w:sz w:val="22"/>
+                <w:szCs w:val="22"/>
+              </w:rPr>
+              <w:t xml:space="preserve">Siempre (regenerado en cada run)</w:t>
+            </w:r>
+          </w:p>
+        </w:tc>
+        <w:tc>
+          <w:tcPr>
+            <w:tcW w:type="dxa" w:w="3450"/>
+            <w:shd w:fill="FFFFFF" w:val="clear"/>
+            <w:tcMar>
+              <w:top w:type="dxa" w:w="90"/>
+              <w:left w:type="dxa" w:w="120"/>
+              <w:bottom w:type="dxa" w:w="90"/>
+              <w:right w:type="dxa" w:w="120"/>
+            </w:tcMar>
+            <w:vAlign w:val="center"/>
+          </w:tcPr>
+          <w:p>
+            <w:pPr>
+              <w:spacing w:line="260"/>
+            </w:pPr>
+            <w:r>
+              <w:rPr>
+                <w:rFonts w:ascii="Calibri" w:cs="Calibri" w:eastAsia="Calibri" w:hAnsi="Calibri"/>
+                <w:sz w:val="22"/>
+                <w:szCs w:val="22"/>
+              </w:rPr>
+              <w:t xml:space="preserve">Editar los valores de las custom properties (--bg, --accent, --gradient-brand, etc.) — Capítulo 11.4. Claro es el default; --tint/--glass-bg cambian con :root[data-theme="dark"].</w:t>
             </w:r>
           </w:p>
         </w:tc>
@@ -16768,6 +20158,47 @@
           <w:szCs w:val="22"/>
         </w:rPr>
         <w:t xml:space="preserve">Punto de inflexión de la curva logística (x0) en statistical-engine.js — el nivel de carga donde el rendimiento marginal empieza a caer.</w:t>
+      </w:r>
+    </w:p>
+    <w:p>
+      <w:pPr>
+        <w:spacing w:after="180" w:line="300"/>
+        <w:jc w:val="both"/>
+      </w:pPr>
+      <w:r>
+        <w:rPr>
+          <w:rFonts w:ascii="Calibri" w:cs="Calibri" w:eastAsia="Calibri" w:hAnsi="Calibri"/>
+          <w:b/>
+          <w:bCs/>
+          <w:sz w:val="22"/>
+          <w:szCs w:val="22"/>
+        </w:rPr>
+        <w:t xml:space="preserve">DataKind: </w:t>
+      </w:r>
+      <w:r>
+        <w:rPr>
+          <w:rFonts w:ascii="Calibri" w:cs="Calibri" w:eastAsia="Calibri" w:hAnsi="Calibri"/>
+          <w:sz w:val="22"/>
+          <w:szCs w:val="22"/>
+        </w:rPr>
+        <w:t xml:space="preserve">Tipo </w:t>
+      </w:r>
+      <w:r>
+        <w:rPr>
+          <w:rFonts w:ascii="Consolas" w:cs="Consolas" w:eastAsia="Consolas" w:hAnsi="Consolas"/>
+          <w:color w:val="C0392B"/>
+          <w:sz w:val="20"/>
+          <w:szCs w:val="20"/>
+        </w:rPr>
+        <w:t xml:space="preserve">'ui' | 'rest' | 'soap'</w:t>
+      </w:r>
+      <w:r>
+        <w:rPr>
+          <w:rFonts w:ascii="Calibri" w:cs="Calibri" w:eastAsia="Calibri" w:hAnsi="Calibri"/>
+          <w:sz w:val="22"/>
+          <w:szCs w:val="22"/>
+        </w:rPr>
+        <w:t xml:space="preserve"> pasado a findSuiteDataFile()/loadSuiteTestData() para buscar un set de datos exclusivo de ese tipo de prueba (sufijo _Web/_REST/_SOAP) antes de caer al archivo sin sufijo.</w:t>
       </w:r>
     </w:p>
     <w:p>

</xml_diff>